<commit_message>
sempro-dpj4: revisi Gambar 3.1 & 3.2 — font diperbesar 2x (13,5-14px -> 20-26px; teks cetak 3,4pt -> 7,2-7,9pt), tata letak dipadatkan G3.1 1440x2085 / G3.2 1300x1480; rel kanan G3.1 dikoreksi agar setia mmd (hanya S0->T5); pengaman MAXH_PX di generator; QA overflow Playwright 0 + VLM PDF lolos; postcheck 0 error, sinkron 596/596
</commit_message>
<xml_diff>
--- a/13-sempro-docx/Proposal-Sempro-DPJ4-SIBI-CSI.docx
+++ b/13-sempro-docx/Proposal-Sempro-DPJ4-SIBI-CSI.docx
@@ -10873,7 +10873,7 @@
       <w:r>
         <w:drawing>
           <wp:inline distT="0" distB="0" distL="0" distR="0">
-            <wp:extent cx="5038725" cy="4591050"/>
+            <wp:extent cx="5038725" cy="7296150"/>
             <wp:effectExtent t="0" r="0" b="0" l="0"/>
             <wp:docPr id="1" name="" descr="" title=""/>
             <wp:cNvGraphicFramePr>
@@ -10898,7 +10898,7 @@
                   <pic:spPr bwMode="auto">
                     <a:xfrm>
                       <a:off x="0" y="0"/>
-                      <a:ext cx="5038725" cy="4591050"/>
+                      <a:ext cx="5038725" cy="7296150"/>
                     </a:xfrm>
                     <a:prstGeom prst="rect">
                       <a:avLst/>
@@ -14093,7 +14093,7 @@
       <w:r>
         <w:drawing>
           <wp:inline distT="0" distB="0" distL="0" distR="0">
-            <wp:extent cx="5038725" cy="3219450"/>
+            <wp:extent cx="5038725" cy="5734050"/>
             <wp:effectExtent t="0" r="0" b="0" l="0"/>
             <wp:docPr id="2" name="" descr="" title=""/>
             <wp:cNvGraphicFramePr>
@@ -14118,7 +14118,7 @@
                   <pic:spPr bwMode="auto">
                     <a:xfrm>
                       <a:off x="0" y="0"/>
-                      <a:ext cx="5038725" cy="3219450"/>
+                      <a:ext cx="5038725" cy="5734050"/>
                     </a:xfrm>
                     <a:prstGeom prst="rect">
                       <a:avLst/>

</xml_diff>

<commit_message>
Ralat MediaPipe->YOLO26 pose (teks+gambar) + perbaiki tumpang tindih blok G3.1/G3.2
- Estimator jalur pelabelan: model pose YOLO26 (17 keypoint COCO, tanpa jari);
  3 rujukan baru terverifikasi (Jocher 2026 arXiv:2606.03748; Sapkota 2025
  arXiv:2509.25164; dok. Ultralytics Pose); -BlazePose/-MP Hands/-Kim2023;
  MediaPipe tetap sbg fakta skrip RuView ADR-079 [49]
- G3.1: diamond gerbang kini persegi rotasi simetris (AABB 354/212 terkontrol),
  kolom & jalur disusun ulang, label gagal/lolos bebas tabrakan (kanvas 1550x2200)
- G3.2: node kolB tak menempel border panel, lajur koridor terpisah,
  label pelatihan dipindah, node MediaPipe -> Model pose YOLO26
- check_layout.js: pemeriksa geometri deterministik baru (SAT diamond + Liang-Barsky)
  = BERSIH keduanya; rebuild docx/md: 55 hal, postcheck 0 error, sinkron 596/596
- Dokumentasi: catatan.md 5c, lembar-fakta, catatan-pengemasan bagian 8,
  verifikasi yolo26/, README
</commit_message>
<xml_diff>
--- a/13-sempro-docx/Proposal-Sempro-DPJ4-SIBI-CSI.docx
+++ b/13-sempro-docx/Proposal-Sempro-DPJ4-SIBI-CSI.docx
@@ -2131,7 +2131,7 @@
           <w:sz w:val="24"/>
           <w:szCs w:val="24"/>
         </w:rPr>
-        <w:t xml:space="preserve"> MediaPipe [33], dan pada satu kondisi uji persepsi. Rancangan yang dikerjakan dalam penelitian ini mencakup penempatan kedua node, protokol perekaman beserta kurasi kosakata, ekstraksi fitur dan klasifikasi, serta mode latihan umpan balik, sedangkan RuView menjadi basis akuisisinya. Rancangan itu tidak terikat pada satu bahasa isyarat sehingga perluasan ke BISINDO pada prinsipnya cukup dilakukan dengan mengganti </w:t>
+        <w:t xml:space="preserve"> dari model pose YOLO26 [33], dan pada satu kondisi uji persepsi. Rancangan yang dikerjakan dalam penelitian ini mencakup penempatan kedua node, protokol perekaman beserta kurasi kosakata, ekstraksi fitur dan klasifikasi, serta mode latihan umpan balik, sedangkan RuView menjadi basis akuisisinya. Rancangan itu tidak terikat pada satu bahasa isyarat sehingga perluasan ke BISINDO pada prinsipnya cukup dilakukan dengan mengganti </w:t>
       </w:r>
       <w:r>
         <w:rPr>
@@ -4565,7 +4565,59 @@
           <w:sz w:val="24"/>
           <w:szCs w:val="24"/>
         </w:rPr>
-        <w:t xml:space="preserve"> (ADR-079) yang memakai MediaPipe PoseLandmarker.</w:t>
+        <w:t xml:space="preserve"> (ADR-079) yang memakai MediaPipe PoseLandmarker [49] dan menuliskan 17 </w:t>
+      </w:r>
+      <w:r>
+        <w:rPr>
+          <w:rFonts w:ascii="Times New Roman" w:eastAsia="Times New Roman" w:hAnsi="Times New Roman"/>
+          <w:b w:val="false"/>
+          <w:bCs w:val="false"/>
+          <w:i/>
+          <w:iCs/>
+          <w:color w:val="000000"/>
+          <w:sz w:val="24"/>
+          <w:szCs w:val="24"/>
+        </w:rPr>
+        <w:t xml:space="preserve">keypoint</w:t>
+      </w:r>
+      <w:r>
+        <w:rPr>
+          <w:rFonts w:ascii="Times New Roman" w:eastAsia="Times New Roman" w:hAnsi="Times New Roman"/>
+          <w:b w:val="false"/>
+          <w:bCs w:val="false"/>
+          <w:i w:val="false"/>
+          <w:iCs w:val="false"/>
+          <w:color w:val="000000"/>
+          <w:sz w:val="24"/>
+          <w:szCs w:val="24"/>
+        </w:rPr>
+        <w:t xml:space="preserve"> tubuh format COCO untuk setiap </w:t>
+      </w:r>
+      <w:r>
+        <w:rPr>
+          <w:rFonts w:ascii="Times New Roman" w:eastAsia="Times New Roman" w:hAnsi="Times New Roman"/>
+          <w:b w:val="false"/>
+          <w:bCs w:val="false"/>
+          <w:i/>
+          <w:iCs/>
+          <w:color w:val="000000"/>
+          <w:sz w:val="24"/>
+          <w:szCs w:val="24"/>
+        </w:rPr>
+        <w:t xml:space="preserve">frame</w:t>
+      </w:r>
+      <w:r>
+        <w:rPr>
+          <w:rFonts w:ascii="Times New Roman" w:eastAsia="Times New Roman" w:hAnsi="Times New Roman"/>
+          <w:b w:val="false"/>
+          <w:bCs w:val="false"/>
+          <w:i w:val="false"/>
+          <w:iCs w:val="false"/>
+          <w:color w:val="000000"/>
+          <w:sz w:val="24"/>
+          <w:szCs w:val="24"/>
+        </w:rPr>
+        <w:t xml:space="preserve"> video.</w:t>
       </w:r>
     </w:p>
     <w:p>
@@ -5454,7 +5506,7 @@
                 <w:sz w:val="18"/>
                 <w:szCs w:val="18"/>
               </w:rPr>
-              <w:t xml:space="preserve"> MediaPipe, dan CSI pada jalur pelabelan</w:t>
+              <w:t xml:space="preserve"> tubuh, dan CSI pada jalur pelabelan</w:t>
             </w:r>
           </w:p>
         </w:tc>
@@ -5716,7 +5768,7 @@
           <w:sz w:val="24"/>
           <w:szCs w:val="24"/>
         </w:rPr>
-        <w:t xml:space="preserve"> tubuh manusia, seperti bahu, siku, dan pergelangan tangan, dari citra atau video [49]. MediaPipe [33] merupakan kerangka kerja untuk membangun </w:t>
+        <w:t xml:space="preserve"> tubuh manusia, seperti bahu, siku, dan pergelangan tangan, dari citra atau video [50]. YOLO26 merupakan keluarga model visi waktu nyata terbaru dari Ultralytics yang mendukung deteksi, segmentasi, klasifikasi, dan estimasi pose dalam satu kerangka [33]. Model pose YOLO26 dilatih pada </w:t>
       </w:r>
       <w:r>
         <w:rPr>
@@ -5729,20 +5781,20 @@
           <w:sz w:val="24"/>
           <w:szCs w:val="24"/>
         </w:rPr>
-        <w:t xml:space="preserve">pipeline</w:t>
-      </w:r>
-      <w:r>
-        <w:rPr>
-          <w:rFonts w:ascii="Times New Roman" w:eastAsia="Times New Roman" w:hAnsi="Times New Roman"/>
-          <w:b w:val="false"/>
-          <w:bCs w:val="false"/>
-          <w:i w:val="false"/>
-          <w:iCs w:val="false"/>
-          <w:color w:val="000000"/>
-          <w:sz w:val="24"/>
-          <w:szCs w:val="24"/>
-        </w:rPr>
-        <w:t xml:space="preserve"> persepsi. BlazePose [50] melacak pose tubuh secara </w:t>
+        <w:t xml:space="preserve">dataset keypoint</w:t>
+      </w:r>
+      <w:r>
+        <w:rPr>
+          <w:rFonts w:ascii="Times New Roman" w:eastAsia="Times New Roman" w:hAnsi="Times New Roman"/>
+          <w:b w:val="false"/>
+          <w:bCs w:val="false"/>
+          <w:i w:val="false"/>
+          <w:iCs w:val="false"/>
+          <w:color w:val="000000"/>
+          <w:sz w:val="24"/>
+          <w:szCs w:val="24"/>
+        </w:rPr>
+        <w:t xml:space="preserve"> COCO dan menghasilkan 17 </w:t>
       </w:r>
       <w:r>
         <w:rPr>
@@ -5755,20 +5807,20 @@
           <w:sz w:val="24"/>
           <w:szCs w:val="24"/>
         </w:rPr>
-        <w:t xml:space="preserve">real-time</w:t>
-      </w:r>
-      <w:r>
-        <w:rPr>
-          <w:rFonts w:ascii="Times New Roman" w:eastAsia="Times New Roman" w:hAnsi="Times New Roman"/>
-          <w:b w:val="false"/>
-          <w:bCs w:val="false"/>
-          <w:i w:val="false"/>
-          <w:iCs w:val="false"/>
-          <w:color w:val="000000"/>
-          <w:sz w:val="24"/>
-          <w:szCs w:val="24"/>
-        </w:rPr>
-        <w:t xml:space="preserve"> di perangkat dan menghasilkan 33 </w:t>
+        <w:t xml:space="preserve">keypoint</w:t>
+      </w:r>
+      <w:r>
+        <w:rPr>
+          <w:rFonts w:ascii="Times New Roman" w:eastAsia="Times New Roman" w:hAnsi="Times New Roman"/>
+          <w:b w:val="false"/>
+          <w:bCs w:val="false"/>
+          <w:i w:val="false"/>
+          <w:iCs w:val="false"/>
+          <w:color w:val="000000"/>
+          <w:sz w:val="24"/>
+          <w:szCs w:val="24"/>
+        </w:rPr>
+        <w:t xml:space="preserve"> tubuh per orang, mencakup titik wajah, bahu, siku, dan pergelangan tangan, tanpa </w:t>
       </w:r>
       <w:r>
         <w:rPr>
@@ -5781,20 +5833,20 @@
           <w:sz w:val="24"/>
           <w:szCs w:val="24"/>
         </w:rPr>
-        <w:t xml:space="preserve">landmark</w:t>
-      </w:r>
-      <w:r>
-        <w:rPr>
-          <w:rFonts w:ascii="Times New Roman" w:eastAsia="Times New Roman" w:hAnsi="Times New Roman"/>
-          <w:b w:val="false"/>
-          <w:bCs w:val="false"/>
-          <w:i w:val="false"/>
-          <w:iCs w:val="false"/>
-          <w:color w:val="000000"/>
-          <w:sz w:val="24"/>
-          <w:szCs w:val="24"/>
-        </w:rPr>
-        <w:t xml:space="preserve"> tubuh, sedangkan MediaPipe Hands [51] melacak tangan secara </w:t>
+        <w:t xml:space="preserve">keypoint</w:t>
+      </w:r>
+      <w:r>
+        <w:rPr>
+          <w:rFonts w:ascii="Times New Roman" w:eastAsia="Times New Roman" w:hAnsi="Times New Roman"/>
+          <w:b w:val="false"/>
+          <w:bCs w:val="false"/>
+          <w:i w:val="false"/>
+          <w:iCs w:val="false"/>
+          <w:color w:val="000000"/>
+          <w:sz w:val="24"/>
+          <w:szCs w:val="24"/>
+        </w:rPr>
+        <w:t xml:space="preserve"> jari [51]. Analisis independen atas YOLO26 menunjukkan bahwa model ini dirancang untuk efisiensi inferensi dan kesiapan penerapan pada perangkat tepi (</w:t>
       </w:r>
       <w:r>
         <w:rPr>
@@ -5807,20 +5859,20 @@
           <w:sz w:val="24"/>
           <w:szCs w:val="24"/>
         </w:rPr>
-        <w:t xml:space="preserve">real-time</w:t>
-      </w:r>
-      <w:r>
-        <w:rPr>
-          <w:rFonts w:ascii="Times New Roman" w:eastAsia="Times New Roman" w:hAnsi="Times New Roman"/>
-          <w:b w:val="false"/>
-          <w:bCs w:val="false"/>
-          <w:i w:val="false"/>
-          <w:iCs w:val="false"/>
-          <w:color w:val="000000"/>
-          <w:sz w:val="24"/>
-          <w:szCs w:val="24"/>
-        </w:rPr>
-        <w:t xml:space="preserve"> dan menghasilkan 21 </w:t>
+        <w:t xml:space="preserve">edge</w:t>
+      </w:r>
+      <w:r>
+        <w:rPr>
+          <w:rFonts w:ascii="Times New Roman" w:eastAsia="Times New Roman" w:hAnsi="Times New Roman"/>
+          <w:b w:val="false"/>
+          <w:bCs w:val="false"/>
+          <w:i w:val="false"/>
+          <w:iCs w:val="false"/>
+          <w:color w:val="000000"/>
+          <w:sz w:val="24"/>
+          <w:szCs w:val="24"/>
+        </w:rPr>
+        <w:t xml:space="preserve">) [52]. Dalam penelitian ini, model pose YOLO26 dipakai sebagai estimator terlatih tanpa pelatihan ulang; </w:t>
       </w:r>
       <w:r>
         <w:rPr>
@@ -5833,20 +5885,20 @@
           <w:sz w:val="24"/>
           <w:szCs w:val="24"/>
         </w:rPr>
-        <w:t xml:space="preserve">landmark</w:t>
-      </w:r>
-      <w:r>
-        <w:rPr>
-          <w:rFonts w:ascii="Times New Roman" w:eastAsia="Times New Roman" w:hAnsi="Times New Roman"/>
-          <w:b w:val="false"/>
-          <w:bCs w:val="false"/>
-          <w:i w:val="false"/>
-          <w:iCs w:val="false"/>
-          <w:color w:val="000000"/>
-          <w:sz w:val="24"/>
-          <w:szCs w:val="24"/>
-        </w:rPr>
-        <w:t xml:space="preserve"> per tangan. Kim dkk. [52] memberikan contoh penerapan MediaPipe Pose untuk estimasi pose manusia yang dioptimalkan dengan model </w:t>
+        <w:t xml:space="preserve">pipeline</w:t>
+      </w:r>
+      <w:r>
+        <w:rPr>
+          <w:rFonts w:ascii="Times New Roman" w:eastAsia="Times New Roman" w:hAnsi="Times New Roman"/>
+          <w:b w:val="false"/>
+          <w:bCs w:val="false"/>
+          <w:i w:val="false"/>
+          <w:iCs w:val="false"/>
+          <w:color w:val="000000"/>
+          <w:sz w:val="24"/>
+          <w:szCs w:val="24"/>
+        </w:rPr>
+        <w:t xml:space="preserve"> akuisisi tersinkron mengikuti pola ADR-079 RuView (Subbab 2.4) dengan estimator MediaPipe PoseLandmarker diganti model pose YOLO26 yang keluarannya juga 17 </w:t>
       </w:r>
       <w:r>
         <w:rPr>
@@ -5859,20 +5911,20 @@
           <w:sz w:val="24"/>
           <w:szCs w:val="24"/>
         </w:rPr>
-        <w:t xml:space="preserve">humanoid</w:t>
-      </w:r>
-      <w:r>
-        <w:rPr>
-          <w:rFonts w:ascii="Times New Roman" w:eastAsia="Times New Roman" w:hAnsi="Times New Roman"/>
-          <w:b w:val="false"/>
-          <w:bCs w:val="false"/>
-          <w:i w:val="false"/>
-          <w:iCs w:val="false"/>
-          <w:color w:val="000000"/>
-          <w:sz w:val="24"/>
-          <w:szCs w:val="24"/>
-        </w:rPr>
-        <w:t xml:space="preserve">. MediaPipe PoseLandmarker sudah terintegrasi pada </w:t>
+        <w:t xml:space="preserve">keypoint</w:t>
+      </w:r>
+      <w:r>
+        <w:rPr>
+          <w:rFonts w:ascii="Times New Roman" w:eastAsia="Times New Roman" w:hAnsi="Times New Roman"/>
+          <w:b w:val="false"/>
+          <w:bCs w:val="false"/>
+          <w:i w:val="false"/>
+          <w:iCs w:val="false"/>
+          <w:color w:val="000000"/>
+          <w:sz w:val="24"/>
+          <w:szCs w:val="24"/>
+        </w:rPr>
+        <w:t xml:space="preserve"> format COCO, setara dengan format keluaran skrip asli, sehingga penelitian ini tetap tidak melatih model visi baru. Karena keluaran model hanya mencakup tubuh, deret </w:t>
       </w:r>
       <w:r>
         <w:rPr>
@@ -5885,20 +5937,20 @@
           <w:sz w:val="24"/>
           <w:szCs w:val="24"/>
         </w:rPr>
-        <w:t xml:space="preserve">pipeline</w:t>
-      </w:r>
-      <w:r>
-        <w:rPr>
-          <w:rFonts w:ascii="Times New Roman" w:eastAsia="Times New Roman" w:hAnsi="Times New Roman"/>
-          <w:b w:val="false"/>
-          <w:bCs w:val="false"/>
-          <w:i w:val="false"/>
-          <w:iCs w:val="false"/>
-          <w:color w:val="000000"/>
-          <w:sz w:val="24"/>
-          <w:szCs w:val="24"/>
-        </w:rPr>
-        <w:t xml:space="preserve"> akuisisi tersinkron ADR-079 di RuView (Subbab 2.4) sehingga penelitian ini menggunakan MediaPipe yang tersedia dan tidak melatih model visi baru. </w:t>
+        <w:t xml:space="preserve">keypoint</w:t>
+      </w:r>
+      <w:r>
+        <w:rPr>
+          <w:rFonts w:ascii="Times New Roman" w:eastAsia="Times New Roman" w:hAnsi="Times New Roman"/>
+          <w:b w:val="false"/>
+          <w:bCs w:val="false"/>
+          <w:i w:val="false"/>
+          <w:iCs w:val="false"/>
+          <w:color w:val="000000"/>
+          <w:sz w:val="24"/>
+          <w:szCs w:val="24"/>
+        </w:rPr>
+        <w:t xml:space="preserve"> pada jalur pelabelan tidak memuat </w:t>
       </w:r>
       <w:r>
         <w:rPr>
@@ -5911,58 +5963,6 @@
           <w:sz w:val="24"/>
           <w:szCs w:val="24"/>
         </w:rPr>
-        <w:t xml:space="preserve">Landmark</w:t>
-      </w:r>
-      <w:r>
-        <w:rPr>
-          <w:rFonts w:ascii="Times New Roman" w:eastAsia="Times New Roman" w:hAnsi="Times New Roman"/>
-          <w:b w:val="false"/>
-          <w:bCs w:val="false"/>
-          <w:i w:val="false"/>
-          <w:iCs w:val="false"/>
-          <w:color w:val="000000"/>
-          <w:sz w:val="24"/>
-          <w:szCs w:val="24"/>
-        </w:rPr>
-        <w:t xml:space="preserve"> tangan dari MediaPipe Hands melengkapi </w:t>
-      </w:r>
-      <w:r>
-        <w:rPr>
-          <w:rFonts w:ascii="Times New Roman" w:eastAsia="Times New Roman" w:hAnsi="Times New Roman"/>
-          <w:b w:val="false"/>
-          <w:bCs w:val="false"/>
-          <w:i/>
-          <w:iCs/>
-          <w:color w:val="000000"/>
-          <w:sz w:val="24"/>
-          <w:szCs w:val="24"/>
-        </w:rPr>
-        <w:t xml:space="preserve">landmark</w:t>
-      </w:r>
-      <w:r>
-        <w:rPr>
-          <w:rFonts w:ascii="Times New Roman" w:eastAsia="Times New Roman" w:hAnsi="Times New Roman"/>
-          <w:b w:val="false"/>
-          <w:bCs w:val="false"/>
-          <w:i w:val="false"/>
-          <w:iCs w:val="false"/>
-          <w:color w:val="000000"/>
-          <w:sz w:val="24"/>
-          <w:szCs w:val="24"/>
-        </w:rPr>
-        <w:t xml:space="preserve"> tubuh tersebut dalam deret </w:t>
-      </w:r>
-      <w:r>
-        <w:rPr>
-          <w:rFonts w:ascii="Times New Roman" w:eastAsia="Times New Roman" w:hAnsi="Times New Roman"/>
-          <w:b w:val="false"/>
-          <w:bCs w:val="false"/>
-          <w:i/>
-          <w:iCs/>
-          <w:color w:val="000000"/>
-          <w:sz w:val="24"/>
-          <w:szCs w:val="24"/>
-        </w:rPr>
         <w:t xml:space="preserve">keypoint</w:t>
       </w:r>
       <w:r>
@@ -5976,7 +5976,7 @@
           <w:sz w:val="24"/>
           <w:szCs w:val="24"/>
         </w:rPr>
-        <w:t xml:space="preserve"> yang dipakai pada jalur pelabelan (BAB III).</w:t>
+        <w:t xml:space="preserve"> jari; batas tersebut sejalan dengan cakupan pengenalan yang memang dibatasi pada lintasan lengan, tubuh atas, dan kepala (Subbab 2.3).</w:t>
       </w:r>
     </w:p>
     <w:p>
@@ -6016,7 +6016,7 @@
           <w:sz w:val="24"/>
           <w:szCs w:val="24"/>
         </w:rPr>
-        <w:t xml:space="preserve">Dalam penelitian ini, konsep tersebut tidak diterapkan pada pelatihan klasifikator. Label kelas isyarat berasal dari protokol elisitasi: kartu pemandu ditampilkan sebelum setiap repetisi sehingga kelas setiap segmen sudah diketahui. MediaPipe hanya memberikan deret </w:t>
+        <w:t xml:space="preserve">Dalam penelitian ini, konsep tersebut tidak diterapkan pada pelatihan klasifikator. Label kelas isyarat berasal dari protokol elisitasi: kartu pemandu ditampilkan sebelum setiap repetisi sehingga kelas setiap segmen sudah diketahui. Model pose YOLO26 hanya memberikan deret </w:t>
       </w:r>
       <w:r>
         <w:rPr>
@@ -6042,7 +6042,7 @@
           <w:sz w:val="24"/>
           <w:szCs w:val="24"/>
         </w:rPr>
-        <w:t xml:space="preserve"> yang digunakan untuk tiga keperluan. Pertama, batas awal dan akhir segmen isyarat diverifikasi. Kedua, segmen buruk disaring, misalnya ketika orang tidak terdeteksi atau </w:t>
+        <w:t xml:space="preserve"> tubuh yang digunakan untuk tiga keperluan. Pertama, batas awal dan akhir segmen isyarat diverifikasi. Kedua, segmen buruk disaring, misalnya ketika orang tidak terdeteksi atau </w:t>
       </w:r>
       <w:r>
         <w:rPr>
@@ -10873,7 +10873,7 @@
       <w:r>
         <w:drawing>
           <wp:inline distT="0" distB="0" distL="0" distR="0">
-            <wp:extent cx="5038725" cy="7296150"/>
+            <wp:extent cx="5038725" cy="7153275"/>
             <wp:effectExtent t="0" r="0" b="0" l="0"/>
             <wp:docPr id="1" name="" descr="" title=""/>
             <wp:cNvGraphicFramePr>
@@ -10898,7 +10898,7 @@
                   <pic:spPr bwMode="auto">
                     <a:xfrm>
                       <a:off x="0" y="0"/>
-                      <a:ext cx="5038725" cy="7296150"/>
+                      <a:ext cx="5038725" cy="7153275"/>
                     </a:xfrm>
                     <a:prstGeom prst="rect">
                       <a:avLst/>
@@ -12792,9 +12792,9 @@
         <w:tblLayout w:type="fixed"/>
       </w:tblPr>
       <w:tblGrid>
-        <w:gridCol w:w="635"/>
-        <w:gridCol w:w="3254"/>
-        <w:gridCol w:w="4048"/>
+        <w:gridCol w:w="556"/>
+        <w:gridCol w:w="3572"/>
+        <w:gridCol w:w="3810"/>
       </w:tblGrid>
       <w:tr>
         <w:trPr>
@@ -12803,7 +12803,7 @@
         </w:trPr>
         <w:tc>
           <w:tcPr>
-            <w:tcW w:type="pct" w:w="400"/>
+            <w:tcW w:type="pct" w:w="350"/>
             <w:tcBorders>
               <w:top w:val="none" w:color="FFFFFF" w:sz="0"/>
               <w:left w:val="none" w:color="FFFFFF" w:sz="0"/>
@@ -12840,7 +12840,7 @@
         </w:tc>
         <w:tc>
           <w:tcPr>
-            <w:tcW w:type="pct" w:w="2050"/>
+            <w:tcW w:type="pct" w:w="2250"/>
             <w:tcBorders>
               <w:top w:val="none" w:color="FFFFFF" w:sz="0"/>
               <w:left w:val="none" w:color="FFFFFF" w:sz="0"/>
@@ -12877,7 +12877,7 @@
         </w:tc>
         <w:tc>
           <w:tcPr>
-            <w:tcW w:type="pct" w:w="2550"/>
+            <w:tcW w:type="pct" w:w="2400"/>
             <w:tcBorders>
               <w:top w:val="none" w:color="FFFFFF" w:sz="0"/>
               <w:left w:val="none" w:color="FFFFFF" w:sz="0"/>
@@ -12919,7 +12919,7 @@
         </w:trPr>
         <w:tc>
           <w:tcPr>
-            <w:tcW w:type="pct" w:w="400"/>
+            <w:tcW w:type="pct" w:w="350"/>
             <w:tcBorders>
               <w:top w:val="none" w:color="FFFFFF" w:sz="0"/>
               <w:left w:val="none" w:color="FFFFFF" w:sz="0"/>
@@ -12955,7 +12955,7 @@
         </w:tc>
         <w:tc>
           <w:tcPr>
-            <w:tcW w:type="pct" w:w="2050"/>
+            <w:tcW w:type="pct" w:w="2250"/>
             <w:tcBorders>
               <w:top w:val="none" w:color="FFFFFF" w:sz="0"/>
               <w:left w:val="none" w:color="FFFFFF" w:sz="0"/>
@@ -13004,7 +13004,7 @@
         </w:tc>
         <w:tc>
           <w:tcPr>
-            <w:tcW w:type="pct" w:w="2550"/>
+            <w:tcW w:type="pct" w:w="2400"/>
             <w:tcBorders>
               <w:top w:val="none" w:color="FFFFFF" w:sz="0"/>
               <w:left w:val="none" w:color="FFFFFF" w:sz="0"/>
@@ -13097,7 +13097,7 @@
         </w:trPr>
         <w:tc>
           <w:tcPr>
-            <w:tcW w:type="pct" w:w="400"/>
+            <w:tcW w:type="pct" w:w="350"/>
             <w:tcBorders>
               <w:top w:val="none" w:color="FFFFFF" w:sz="0"/>
               <w:left w:val="none" w:color="FFFFFF" w:sz="0"/>
@@ -13133,7 +13133,7 @@
         </w:tc>
         <w:tc>
           <w:tcPr>
-            <w:tcW w:type="pct" w:w="2050"/>
+            <w:tcW w:type="pct" w:w="2250"/>
             <w:tcBorders>
               <w:top w:val="none" w:color="FFFFFF" w:sz="0"/>
               <w:left w:val="none" w:color="FFFFFF" w:sz="0"/>
@@ -13182,7 +13182,7 @@
         </w:tc>
         <w:tc>
           <w:tcPr>
-            <w:tcW w:type="pct" w:w="2550"/>
+            <w:tcW w:type="pct" w:w="2400"/>
             <w:tcBorders>
               <w:top w:val="none" w:color="FFFFFF" w:sz="0"/>
               <w:left w:val="none" w:color="FFFFFF" w:sz="0"/>
@@ -13223,7 +13223,7 @@
         </w:trPr>
         <w:tc>
           <w:tcPr>
-            <w:tcW w:type="pct" w:w="400"/>
+            <w:tcW w:type="pct" w:w="350"/>
             <w:tcBorders>
               <w:top w:val="none" w:color="FFFFFF" w:sz="0"/>
               <w:left w:val="none" w:color="FFFFFF" w:sz="0"/>
@@ -13259,7 +13259,7 @@
         </w:tc>
         <w:tc>
           <w:tcPr>
-            <w:tcW w:type="pct" w:w="2050"/>
+            <w:tcW w:type="pct" w:w="2250"/>
             <w:tcBorders>
               <w:top w:val="none" w:color="FFFFFF" w:sz="0"/>
               <w:left w:val="none" w:color="FFFFFF" w:sz="0"/>
@@ -13302,43 +13302,43 @@
                 <w:sz w:val="18"/>
                 <w:szCs w:val="18"/>
               </w:rPr>
-              <w:t xml:space="preserve"> (ADR-079)</w:t>
-            </w:r>
-          </w:p>
-        </w:tc>
-        <w:tc>
-          <w:tcPr>
-            <w:tcW w:type="pct" w:w="2550"/>
-            <w:tcBorders>
-              <w:top w:val="none" w:color="FFFFFF" w:sz="0"/>
-              <w:left w:val="none" w:color="FFFFFF" w:sz="0"/>
-              <w:bottom w:val="none" w:color="FFFFFF" w:sz="0"/>
-              <w:right w:val="none" w:color="FFFFFF" w:sz="0"/>
-            </w:tcBorders>
-            <w:tcMar>
-              <w:top w:type="dxa" w:w="40"/>
-              <w:left w:type="dxa" w:w="80"/>
-              <w:bottom w:type="dxa" w:w="40"/>
-              <w:right w:type="dxa" w:w="80"/>
-            </w:tcMar>
-          </w:tcPr>
-          <w:p>
-            <w:pPr>
-              <w:spacing w:after="20" w:before="20" w:line="276"/>
-              <w:jc w:val="left"/>
-            </w:pPr>
-            <w:r>
-              <w:rPr>
-                <w:rFonts w:ascii="Times New Roman" w:eastAsia="Times New Roman" w:hAnsi="Times New Roman"/>
-                <w:b w:val="false"/>
-                <w:bCs w:val="false"/>
-                <w:i w:val="false"/>
-                <w:iCs w:val="false"/>
-                <w:color w:val="000000"/>
-                <w:sz w:val="18"/>
-                <w:szCs w:val="18"/>
-              </w:rPr>
-              <w:t xml:space="preserve">Menyinkronkan akuisisi kamera dan CSI dengan MediaPipe PoseLandmarker</w:t>
+              <w:t xml:space="preserve"> (ADR-079, diadaptasi)</w:t>
+            </w:r>
+          </w:p>
+        </w:tc>
+        <w:tc>
+          <w:tcPr>
+            <w:tcW w:type="pct" w:w="2400"/>
+            <w:tcBorders>
+              <w:top w:val="none" w:color="FFFFFF" w:sz="0"/>
+              <w:left w:val="none" w:color="FFFFFF" w:sz="0"/>
+              <w:bottom w:val="none" w:color="FFFFFF" w:sz="0"/>
+              <w:right w:val="none" w:color="FFFFFF" w:sz="0"/>
+            </w:tcBorders>
+            <w:tcMar>
+              <w:top w:type="dxa" w:w="40"/>
+              <w:left w:type="dxa" w:w="80"/>
+              <w:bottom w:type="dxa" w:w="40"/>
+              <w:right w:type="dxa" w:w="80"/>
+            </w:tcMar>
+          </w:tcPr>
+          <w:p>
+            <w:pPr>
+              <w:spacing w:after="20" w:before="20" w:line="276"/>
+              <w:jc w:val="left"/>
+            </w:pPr>
+            <w:r>
+              <w:rPr>
+                <w:rFonts w:ascii="Times New Roman" w:eastAsia="Times New Roman" w:hAnsi="Times New Roman"/>
+                <w:b w:val="false"/>
+                <w:bCs w:val="false"/>
+                <w:i w:val="false"/>
+                <w:iCs w:val="false"/>
+                <w:color w:val="000000"/>
+                <w:sz w:val="18"/>
+                <w:szCs w:val="18"/>
+              </w:rPr>
+              <w:t xml:space="preserve">Menyinkronkan akuisisi kamera dan CSI; estimator pose diganti model YOLO26</w:t>
             </w:r>
           </w:p>
         </w:tc>
@@ -13349,7 +13349,7 @@
         </w:trPr>
         <w:tc>
           <w:tcPr>
-            <w:tcW w:type="pct" w:w="400"/>
+            <w:tcW w:type="pct" w:w="350"/>
             <w:tcBorders>
               <w:top w:val="none" w:color="FFFFFF" w:sz="0"/>
               <w:left w:val="none" w:color="FFFFFF" w:sz="0"/>
@@ -13385,73 +13385,73 @@
         </w:tc>
         <w:tc>
           <w:tcPr>
-            <w:tcW w:type="pct" w:w="2050"/>
-            <w:tcBorders>
-              <w:top w:val="none" w:color="FFFFFF" w:sz="0"/>
-              <w:left w:val="none" w:color="FFFFFF" w:sz="0"/>
-              <w:bottom w:val="none" w:color="FFFFFF" w:sz="0"/>
-              <w:right w:val="none" w:color="FFFFFF" w:sz="0"/>
-            </w:tcBorders>
-            <w:tcMar>
-              <w:top w:type="dxa" w:w="40"/>
-              <w:left w:type="dxa" w:w="80"/>
-              <w:bottom w:type="dxa" w:w="40"/>
-              <w:right w:type="dxa" w:w="80"/>
-            </w:tcMar>
-          </w:tcPr>
-          <w:p>
-            <w:pPr>
-              <w:spacing w:after="20" w:before="20" w:line="276"/>
-              <w:jc w:val="left"/>
-            </w:pPr>
-            <w:r>
-              <w:rPr>
-                <w:rFonts w:ascii="Times New Roman" w:eastAsia="Times New Roman" w:hAnsi="Times New Roman"/>
-                <w:b w:val="false"/>
-                <w:bCs w:val="false"/>
-                <w:i w:val="false"/>
-                <w:iCs w:val="false"/>
-                <w:color w:val="000000"/>
-                <w:sz w:val="18"/>
-                <w:szCs w:val="18"/>
-              </w:rPr>
-              <w:t xml:space="preserve">MediaPipe (Pose, Hands)</w:t>
-            </w:r>
-          </w:p>
-        </w:tc>
-        <w:tc>
-          <w:tcPr>
-            <w:tcW w:type="pct" w:w="2550"/>
-            <w:tcBorders>
-              <w:top w:val="none" w:color="FFFFFF" w:sz="0"/>
-              <w:left w:val="none" w:color="FFFFFF" w:sz="0"/>
-              <w:bottom w:val="none" w:color="FFFFFF" w:sz="0"/>
-              <w:right w:val="none" w:color="FFFFFF" w:sz="0"/>
-            </w:tcBorders>
-            <w:tcMar>
-              <w:top w:type="dxa" w:w="40"/>
-              <w:left w:type="dxa" w:w="80"/>
-              <w:bottom w:type="dxa" w:w="40"/>
-              <w:right w:type="dxa" w:w="80"/>
-            </w:tcMar>
-          </w:tcPr>
-          <w:p>
-            <w:pPr>
-              <w:spacing w:after="20" w:before="20" w:line="276"/>
-              <w:jc w:val="left"/>
-            </w:pPr>
-            <w:r>
-              <w:rPr>
-                <w:rFonts w:ascii="Times New Roman" w:eastAsia="Times New Roman" w:hAnsi="Times New Roman"/>
-                <w:b w:val="false"/>
-                <w:bCs w:val="false"/>
-                <w:i w:val="false"/>
-                <w:iCs w:val="false"/>
-                <w:color w:val="000000"/>
-                <w:sz w:val="18"/>
-                <w:szCs w:val="18"/>
-              </w:rPr>
-              <w:t xml:space="preserve">Menghasilkan deret </w:t>
+            <w:tcW w:type="pct" w:w="2250"/>
+            <w:tcBorders>
+              <w:top w:val="none" w:color="FFFFFF" w:sz="0"/>
+              <w:left w:val="none" w:color="FFFFFF" w:sz="0"/>
+              <w:bottom w:val="none" w:color="FFFFFF" w:sz="0"/>
+              <w:right w:val="none" w:color="FFFFFF" w:sz="0"/>
+            </w:tcBorders>
+            <w:tcMar>
+              <w:top w:type="dxa" w:w="40"/>
+              <w:left w:type="dxa" w:w="80"/>
+              <w:bottom w:type="dxa" w:w="40"/>
+              <w:right w:type="dxa" w:w="80"/>
+            </w:tcMar>
+          </w:tcPr>
+          <w:p>
+            <w:pPr>
+              <w:spacing w:after="20" w:before="20" w:line="276"/>
+              <w:jc w:val="left"/>
+            </w:pPr>
+            <w:r>
+              <w:rPr>
+                <w:rFonts w:ascii="Times New Roman" w:eastAsia="Times New Roman" w:hAnsi="Times New Roman"/>
+                <w:b w:val="false"/>
+                <w:bCs w:val="false"/>
+                <w:i w:val="false"/>
+                <w:iCs w:val="false"/>
+                <w:color w:val="000000"/>
+                <w:sz w:val="18"/>
+                <w:szCs w:val="18"/>
+              </w:rPr>
+              <w:t xml:space="preserve">Model pose YOLO26 (Ultralytics)</w:t>
+            </w:r>
+          </w:p>
+        </w:tc>
+        <w:tc>
+          <w:tcPr>
+            <w:tcW w:type="pct" w:w="2400"/>
+            <w:tcBorders>
+              <w:top w:val="none" w:color="FFFFFF" w:sz="0"/>
+              <w:left w:val="none" w:color="FFFFFF" w:sz="0"/>
+              <w:bottom w:val="none" w:color="FFFFFF" w:sz="0"/>
+              <w:right w:val="none" w:color="FFFFFF" w:sz="0"/>
+            </w:tcBorders>
+            <w:tcMar>
+              <w:top w:type="dxa" w:w="40"/>
+              <w:left w:type="dxa" w:w="80"/>
+              <w:bottom w:type="dxa" w:w="40"/>
+              <w:right w:type="dxa" w:w="80"/>
+            </w:tcMar>
+          </w:tcPr>
+          <w:p>
+            <w:pPr>
+              <w:spacing w:after="20" w:before="20" w:line="276"/>
+              <w:jc w:val="left"/>
+            </w:pPr>
+            <w:r>
+              <w:rPr>
+                <w:rFonts w:ascii="Times New Roman" w:eastAsia="Times New Roman" w:hAnsi="Times New Roman"/>
+                <w:b w:val="false"/>
+                <w:bCs w:val="false"/>
+                <w:i w:val="false"/>
+                <w:iCs w:val="false"/>
+                <w:color w:val="000000"/>
+                <w:sz w:val="18"/>
+                <w:szCs w:val="18"/>
+              </w:rPr>
+              <w:t xml:space="preserve">Menghasilkan deret 17 </w:t>
             </w:r>
             <w:r>
               <w:rPr>
@@ -13477,7 +13477,7 @@
                 <w:sz w:val="18"/>
                 <w:szCs w:val="18"/>
               </w:rPr>
-              <w:t xml:space="preserve"> tubuh dan tangan dari video pada jalur pelabelan</w:t>
+              <w:t xml:space="preserve"> tubuh format COCO dari video pada jalur pelabelan</w:t>
             </w:r>
           </w:p>
         </w:tc>
@@ -13488,7 +13488,7 @@
         </w:trPr>
         <w:tc>
           <w:tcPr>
-            <w:tcW w:type="pct" w:w="400"/>
+            <w:tcW w:type="pct" w:w="350"/>
             <w:tcBorders>
               <w:top w:val="none" w:color="FFFFFF" w:sz="0"/>
               <w:left w:val="none" w:color="FFFFFF" w:sz="0"/>
@@ -13524,7 +13524,7 @@
         </w:tc>
         <w:tc>
           <w:tcPr>
-            <w:tcW w:type="pct" w:w="2050"/>
+            <w:tcW w:type="pct" w:w="2250"/>
             <w:tcBorders>
               <w:top w:val="none" w:color="FFFFFF" w:sz="0"/>
               <w:left w:val="none" w:color="FFFFFF" w:sz="0"/>
@@ -13560,7 +13560,7 @@
         </w:tc>
         <w:tc>
           <w:tcPr>
-            <w:tcW w:type="pct" w:w="2550"/>
+            <w:tcW w:type="pct" w:w="2400"/>
             <w:tcBorders>
               <w:top w:val="none" w:color="FFFFFF" w:sz="0"/>
               <w:left w:val="none" w:color="FFFFFF" w:sz="0"/>
@@ -13601,7 +13601,7 @@
         </w:trPr>
         <w:tc>
           <w:tcPr>
-            <w:tcW w:type="pct" w:w="400"/>
+            <w:tcW w:type="pct" w:w="350"/>
             <w:tcBorders>
               <w:top w:val="none" w:color="FFFFFF" w:sz="0"/>
               <w:left w:val="none" w:color="FFFFFF" w:sz="0"/>
@@ -13637,7 +13637,7 @@
         </w:tc>
         <w:tc>
           <w:tcPr>
-            <w:tcW w:type="pct" w:w="2050"/>
+            <w:tcW w:type="pct" w:w="2250"/>
             <w:tcBorders>
               <w:top w:val="none" w:color="FFFFFF" w:sz="0"/>
               <w:left w:val="none" w:color="FFFFFF" w:sz="0"/>
@@ -13673,7 +13673,7 @@
         </w:tc>
         <w:tc>
           <w:tcPr>
-            <w:tcW w:type="pct" w:w="2550"/>
+            <w:tcW w:type="pct" w:w="2400"/>
             <w:tcBorders>
               <w:top w:val="none" w:color="FFFFFF" w:sz="0"/>
               <w:left w:val="none" w:color="FFFFFF" w:sz="0"/>
@@ -13714,7 +13714,7 @@
         </w:trPr>
         <w:tc>
           <w:tcPr>
-            <w:tcW w:type="pct" w:w="400"/>
+            <w:tcW w:type="pct" w:w="350"/>
             <w:tcBorders>
               <w:top w:val="none" w:color="FFFFFF" w:sz="0"/>
               <w:left w:val="none" w:color="FFFFFF" w:sz="0"/>
@@ -13750,7 +13750,7 @@
         </w:tc>
         <w:tc>
           <w:tcPr>
-            <w:tcW w:type="pct" w:w="2050"/>
+            <w:tcW w:type="pct" w:w="2250"/>
             <w:tcBorders>
               <w:top w:val="none" w:color="FFFFFF" w:sz="0"/>
               <w:left w:val="none" w:color="FFFFFF" w:sz="0"/>
@@ -13786,7 +13786,7 @@
         </w:tc>
         <w:tc>
           <w:tcPr>
-            <w:tcW w:type="pct" w:w="2550"/>
+            <w:tcW w:type="pct" w:w="2400"/>
             <w:tcBorders>
               <w:top w:val="none" w:color="FFFFFF" w:sz="0"/>
               <w:left w:val="none" w:color="FFFFFF" w:sz="0"/>
@@ -13827,7 +13827,7 @@
         </w:trPr>
         <w:tc>
           <w:tcPr>
-            <w:tcW w:type="pct" w:w="400"/>
+            <w:tcW w:type="pct" w:w="350"/>
             <w:tcBorders>
               <w:top w:val="none" w:color="FFFFFF" w:sz="0"/>
               <w:left w:val="none" w:color="FFFFFF" w:sz="0"/>
@@ -13863,7 +13863,7 @@
         </w:tc>
         <w:tc>
           <w:tcPr>
-            <w:tcW w:type="pct" w:w="2050"/>
+            <w:tcW w:type="pct" w:w="2250"/>
             <w:tcBorders>
               <w:top w:val="none" w:color="FFFFFF" w:sz="0"/>
               <w:left w:val="none" w:color="FFFFFF" w:sz="0"/>
@@ -13912,7 +13912,7 @@
         </w:tc>
         <w:tc>
           <w:tcPr>
-            <w:tcW w:type="pct" w:w="2550"/>
+            <w:tcW w:type="pct" w:w="2400"/>
             <w:tcBorders>
               <w:top w:val="none" w:color="FFFFFF" w:sz="0"/>
               <w:left w:val="none" w:color="FFFFFF" w:sz="0"/>
@@ -14246,7 +14246,7 @@
           <w:sz w:val="24"/>
           <w:szCs w:val="24"/>
         </w:rPr>
-        <w:t xml:space="preserve">. Label kelas berasal dari kartu pemandu yang ditampilkan sebelum setiap repetisi, bukan dari kamera. MediaPipe [33] mengubah video </w:t>
+        <w:t xml:space="preserve">. Label kelas berasal dari kartu pemandu yang ditampilkan sebelum setiap repetisi, bukan dari kamera. Model pose YOLO26 [33] mengubah video </w:t>
       </w:r>
       <w:r>
         <w:rPr>
@@ -14272,7 +14272,7 @@
           <w:sz w:val="24"/>
           <w:szCs w:val="24"/>
         </w:rPr>
-        <w:t xml:space="preserve"> menjadi deret </w:t>
+        <w:t xml:space="preserve"> menjadi deret 17 </w:t>
       </w:r>
       <w:r>
         <w:rPr>
@@ -14298,7 +14298,7 @@
           <w:sz w:val="24"/>
           <w:szCs w:val="24"/>
         </w:rPr>
-        <w:t xml:space="preserve"> tubuh [50] dan tangan [51] yang diselaraskan dengan CSI melalui ADR-079 untuk memverifikasi batas segmen, menyaring segmen buruk, dan mendiagnosis kesalahan klasifikator secara luring. Berbeda dengan preseden Person-in-WiFi [53] dan DensePose From WiFi [54] (Subbab 2.5), dalam penelitian ini kamera tidak mengajarkan pose kepada model CSI; distilasi pengetahuan penuh ditempatkan sebagai penelitian lanjutan.</w:t>
+        <w:t xml:space="preserve"> tubuh format COCO [51] yang diselaraskan dengan CSI melalui pola ADR-079 untuk memverifikasi batas segmen, menyaring segmen buruk, dan mendiagnosis kesalahan klasifikator secara luring. Berbeda dengan preseden Person-in-WiFi [53] dan DensePose From WiFi [54] (Subbab 2.5), dalam penelitian ini kamera tidak mengajarkan pose kepada model CSI; distilasi pengetahuan penuh ditempatkan sebagai penelitian lanjutan.</w:t>
       </w:r>
     </w:p>
     <w:p>
@@ -14846,7 +14846,7 @@
           <w:sz w:val="24"/>
           <w:szCs w:val="24"/>
         </w:rPr>
-        <w:t xml:space="preserve">Membuang segmen bila orang tidak terdeteksi MediaPipe, </w:t>
+        <w:t xml:space="preserve">Membuang segmen bila orang tidak terdeteksi oleh model pose, </w:t>
       </w:r>
       <w:r>
         <w:rPr>
@@ -17738,7 +17738,7 @@
           <w:sz w:val="24"/>
           <w:szCs w:val="24"/>
         </w:rPr>
-        <w:t xml:space="preserve"> MediaPipe untuk membedakan kesalahan akibat lintasan yang mirip dari kesalahan akibat sinyal CSI yang lemah.</w:t>
+        <w:t xml:space="preserve"> YOLO26 untuk membedakan kesalahan akibat lintasan yang mirip dari kesalahan akibat sinyal CSI yang lemah.</w:t>
       </w:r>
     </w:p>
     <w:p>
@@ -28313,33 +28313,7 @@
           <w:sz w:val="24"/>
           <w:szCs w:val="24"/>
         </w:rPr>
-        <w:t xml:space="preserve">[33] C. Lugaresi </w:t>
-      </w:r>
-      <w:r>
-        <w:rPr>
-          <w:rFonts w:ascii="Times New Roman" w:eastAsia="Times New Roman" w:hAnsi="Times New Roman"/>
-          <w:b w:val="false"/>
-          <w:bCs w:val="false"/>
-          <w:i/>
-          <w:iCs/>
-          <w:color w:val="000000"/>
-          <w:sz w:val="24"/>
-          <w:szCs w:val="24"/>
-        </w:rPr>
-        <w:t xml:space="preserve">et al.</w:t>
-      </w:r>
-      <w:r>
-        <w:rPr>
-          <w:rFonts w:ascii="Times New Roman" w:eastAsia="Times New Roman" w:hAnsi="Times New Roman"/>
-          <w:b w:val="false"/>
-          <w:bCs w:val="false"/>
-          <w:i w:val="false"/>
-          <w:iCs w:val="false"/>
-          <w:color w:val="000000"/>
-          <w:sz w:val="24"/>
-          <w:szCs w:val="24"/>
-        </w:rPr>
-        <w:t xml:space="preserve">, "MediaPipe: A framework for building perception pipelines," arXiv:1906.08172, 2019, doi: 10.48550/arXiv.1906.08172.</w:t>
+        <w:t xml:space="preserve">[33] G. Jocher, J. Qiu, M. Liu, S. Lyu, F. C. Akyon, and M. E. Kalfaoglu, "Ultralytics YOLO26: Unified real-time end-to-end vision models," arXiv:2606.03748, 2026, doi: 10.48550/arXiv.2606.03748.</w:t>
       </w:r>
     </w:p>
     <w:p>
@@ -29049,7 +29023,7 @@
           <w:sz w:val="24"/>
           <w:szCs w:val="24"/>
         </w:rPr>
-        <w:t xml:space="preserve">[49] C. Zheng </w:t>
+        <w:t xml:space="preserve">[49] C. Lugaresi </w:t>
       </w:r>
       <w:r>
         <w:rPr>
@@ -29075,33 +29049,7 @@
           <w:sz w:val="24"/>
           <w:szCs w:val="24"/>
         </w:rPr>
-        <w:t xml:space="preserve">, "Deep learning-based human pose estimation: A survey," </w:t>
-      </w:r>
-      <w:r>
-        <w:rPr>
-          <w:rFonts w:ascii="Times New Roman" w:eastAsia="Times New Roman" w:hAnsi="Times New Roman"/>
-          <w:b w:val="false"/>
-          <w:bCs w:val="false"/>
-          <w:i/>
-          <w:iCs/>
-          <w:color w:val="000000"/>
-          <w:sz w:val="24"/>
-          <w:szCs w:val="24"/>
-        </w:rPr>
-        <w:t xml:space="preserve">ACM Computing Surveys</w:t>
-      </w:r>
-      <w:r>
-        <w:rPr>
-          <w:rFonts w:ascii="Times New Roman" w:eastAsia="Times New Roman" w:hAnsi="Times New Roman"/>
-          <w:b w:val="false"/>
-          <w:bCs w:val="false"/>
-          <w:i w:val="false"/>
-          <w:iCs w:val="false"/>
-          <w:color w:val="000000"/>
-          <w:sz w:val="24"/>
-          <w:szCs w:val="24"/>
-        </w:rPr>
-        <w:t xml:space="preserve">, vol. 56, no. 1, pp. 1–37, 2023, doi: 10.1145/3603618.</w:t>
+        <w:t xml:space="preserve">, "MediaPipe: A framework for building perception pipelines," arXiv:1906.08172, 2019, doi: 10.48550/arXiv.1906.08172.</w:t>
       </w:r>
     </w:p>
     <w:p>
@@ -29121,7 +29069,59 @@
           <w:sz w:val="24"/>
           <w:szCs w:val="24"/>
         </w:rPr>
-        <w:t xml:space="preserve">[50] V. Bazarevsky, I. Grishchenko, K. Raveendran, T. Zhu, F. Zhang, and M. Grundmann, "BlazePose: On-device real-time body pose tracking," arXiv:2006.10204, 2020, doi: 10.48550/arXiv.2006.10204.</w:t>
+        <w:t xml:space="preserve">[50] C. Zheng </w:t>
+      </w:r>
+      <w:r>
+        <w:rPr>
+          <w:rFonts w:ascii="Times New Roman" w:eastAsia="Times New Roman" w:hAnsi="Times New Roman"/>
+          <w:b w:val="false"/>
+          <w:bCs w:val="false"/>
+          <w:i/>
+          <w:iCs/>
+          <w:color w:val="000000"/>
+          <w:sz w:val="24"/>
+          <w:szCs w:val="24"/>
+        </w:rPr>
+        <w:t xml:space="preserve">et al.</w:t>
+      </w:r>
+      <w:r>
+        <w:rPr>
+          <w:rFonts w:ascii="Times New Roman" w:eastAsia="Times New Roman" w:hAnsi="Times New Roman"/>
+          <w:b w:val="false"/>
+          <w:bCs w:val="false"/>
+          <w:i w:val="false"/>
+          <w:iCs w:val="false"/>
+          <w:color w:val="000000"/>
+          <w:sz w:val="24"/>
+          <w:szCs w:val="24"/>
+        </w:rPr>
+        <w:t xml:space="preserve">, "Deep learning-based human pose estimation: A survey," </w:t>
+      </w:r>
+      <w:r>
+        <w:rPr>
+          <w:rFonts w:ascii="Times New Roman" w:eastAsia="Times New Roman" w:hAnsi="Times New Roman"/>
+          <w:b w:val="false"/>
+          <w:bCs w:val="false"/>
+          <w:i/>
+          <w:iCs/>
+          <w:color w:val="000000"/>
+          <w:sz w:val="24"/>
+          <w:szCs w:val="24"/>
+        </w:rPr>
+        <w:t xml:space="preserve">ACM Computing Surveys</w:t>
+      </w:r>
+      <w:r>
+        <w:rPr>
+          <w:rFonts w:ascii="Times New Roman" w:eastAsia="Times New Roman" w:hAnsi="Times New Roman"/>
+          <w:b w:val="false"/>
+          <w:bCs w:val="false"/>
+          <w:i w:val="false"/>
+          <w:iCs w:val="false"/>
+          <w:color w:val="000000"/>
+          <w:sz w:val="24"/>
+          <w:szCs w:val="24"/>
+        </w:rPr>
+        <w:t xml:space="preserve">, vol. 56, no. 1, pp. 1–37, 2023, doi: 10.1145/3603618.</w:t>
       </w:r>
     </w:p>
     <w:p>
@@ -29141,33 +29141,7 @@
           <w:sz w:val="24"/>
           <w:szCs w:val="24"/>
         </w:rPr>
-        <w:t xml:space="preserve">[51] F. Zhang </w:t>
-      </w:r>
-      <w:r>
-        <w:rPr>
-          <w:rFonts w:ascii="Times New Roman" w:eastAsia="Times New Roman" w:hAnsi="Times New Roman"/>
-          <w:b w:val="false"/>
-          <w:bCs w:val="false"/>
-          <w:i/>
-          <w:iCs/>
-          <w:color w:val="000000"/>
-          <w:sz w:val="24"/>
-          <w:szCs w:val="24"/>
-        </w:rPr>
-        <w:t xml:space="preserve">et al.</w:t>
-      </w:r>
-      <w:r>
-        <w:rPr>
-          <w:rFonts w:ascii="Times New Roman" w:eastAsia="Times New Roman" w:hAnsi="Times New Roman"/>
-          <w:b w:val="false"/>
-          <w:bCs w:val="false"/>
-          <w:i w:val="false"/>
-          <w:iCs w:val="false"/>
-          <w:color w:val="000000"/>
-          <w:sz w:val="24"/>
-          <w:szCs w:val="24"/>
-        </w:rPr>
-        <w:t xml:space="preserve">, "MediaPipe Hands: On-device real-time hand tracking," arXiv:2006.10214, 2020, doi: 10.48550/arXiv.2006.10214.</w:t>
+        <w:t xml:space="preserve">[51] Ultralytics, "Pose estimation," Ultralytics YOLO Docs. [Online]. Available: https://docs.ultralytics.com/tasks/pose/, diakses 25 Okt. 2026.</w:t>
       </w:r>
     </w:p>
     <w:p>
@@ -29187,33 +29161,7 @@
           <w:sz w:val="24"/>
           <w:szCs w:val="24"/>
         </w:rPr>
-        <w:t xml:space="preserve">[52] J.-W. Kim, J.-Y. Choi, E.-J. Ha, and J.-H. Choi, "Human pose estimation using MediaPipe Pose and optimization method based on a humanoid model," </w:t>
-      </w:r>
-      <w:r>
-        <w:rPr>
-          <w:rFonts w:ascii="Times New Roman" w:eastAsia="Times New Roman" w:hAnsi="Times New Roman"/>
-          <w:b w:val="false"/>
-          <w:bCs w:val="false"/>
-          <w:i/>
-          <w:iCs/>
-          <w:color w:val="000000"/>
-          <w:sz w:val="24"/>
-          <w:szCs w:val="24"/>
-        </w:rPr>
-        <w:t xml:space="preserve">Applied Sciences</w:t>
-      </w:r>
-      <w:r>
-        <w:rPr>
-          <w:rFonts w:ascii="Times New Roman" w:eastAsia="Times New Roman" w:hAnsi="Times New Roman"/>
-          <w:b w:val="false"/>
-          <w:bCs w:val="false"/>
-          <w:i w:val="false"/>
-          <w:iCs w:val="false"/>
-          <w:color w:val="000000"/>
-          <w:sz w:val="24"/>
-          <w:szCs w:val="24"/>
-        </w:rPr>
-        <w:t xml:space="preserve">, vol. 13, no. 4, Art. no. 2700, 2023, doi: 10.3390/app13042700.</w:t>
+        <w:t xml:space="preserve">[52] R. Sapkota, R. H. Cheppally, A. Sharda, and M. Karkee, "YOLO26: Key architectural enhancements and performance benchmarking for real-time object detection," arXiv:2509.25164, 2025, doi: 10.48550/arXiv.2509.25164.</w:t>
       </w:r>
     </w:p>
     <w:p>

</xml_diff>

<commit_message>
Revisi gambar putaran 3: G3.1 14x12,8cm & G3.2 14x8,9cm, font cetak 7,1-8,1pt (heksagon + alur ular)
</commit_message>
<xml_diff>
--- a/13-sempro-docx/Proposal-Sempro-DPJ4-SIBI-CSI.docx
+++ b/13-sempro-docx/Proposal-Sempro-DPJ4-SIBI-CSI.docx
@@ -513,6 +513,7 @@
         <w:sectPr>
           <w:pgSz w:w="11906" w:h="16838" w:orient="portrait"/>
           <w:pgMar w:top="0" w:right="0" w:bottom="0" w:left="0" w:header="708" w:footer="708" w:gutter="0"/>
+          <w:pgNumType/>
           <w:docGrid w:linePitch="360"/>
         </w:sectPr>
       </w:pPr>
@@ -548,11 +549,7 @@
           </w:pPr>
           <w:r>
             <w:fldChar w:fldCharType="begin" w:dirty="true"/>
-          </w:r>
-          <w:r>
             <w:instrText xml:space="preserve">TOC \h \o "1-3"</w:instrText>
-          </w:r>
-          <w:r>
             <w:fldChar w:fldCharType="separate"/>
           </w:r>
           <w:hyperlink w:history="1" w:anchor="_Toc1">
@@ -572,1044 +569,1242 @@
         </w:p>
         <w:p>
           <w:pPr>
-            <w:pStyle w:val="9"/>
+            <w:pStyle w:val="TOC2"/>
             <w:tabs>
-              <w:tab w:val="right" w:leader="dot" w:pos="9026"/>
+              <w:tab w:val="right" w:pos="7937" w:leader="dot"/>
             </w:tabs>
-            <w:spacing w:before="120" w:after="60"/>
+            <w:ind w:left="220"/>
           </w:pPr>
-          <w:r>
-            <w:t>BAB I PENDAHULUAN</w:t>
-          </w:r>
-          <w:r>
-            <w:tab/>
-          </w:r>
-          <w:r>
-            <w:t>1</w:t>
-          </w:r>
+          <w:hyperlink w:history="1" w:anchor="_Toc2">
+            <w:r>
+              <w:t xml:space="preserve">1.1 Latar Belakang</w:t>
+            </w:r>
+            <w:r>
+              <w:tab/>
+            </w:r>
+            <w:r>
+              <w:fldChar w:fldCharType="begin" w:dirty="true"/>
+              <w:instrText xml:space="preserve">PAGEREF _Toc2 \h</w:instrText>
+              <w:fldChar w:fldCharType="separate"/>
+              <w:fldChar w:fldCharType="end"/>
+            </w:r>
+          </w:hyperlink>
         </w:p>
         <w:p>
           <w:pPr>
-            <w:pStyle w:val="11"/>
-            <w:ind w:left="360"/>
+            <w:pStyle w:val="TOC2"/>
             <w:tabs>
-              <w:tab w:val="right" w:leader="dot" w:pos="9026"/>
+              <w:tab w:val="right" w:pos="7937" w:leader="dot"/>
             </w:tabs>
-            <w:spacing w:before="120" w:after="60"/>
+            <w:ind w:left="220"/>
           </w:pPr>
-          <w:r>
-            <w:t>1.1 Latar Belakang</w:t>
-          </w:r>
-          <w:r>
-            <w:tab/>
-          </w:r>
-          <w:r>
-            <w:t>1</w:t>
-          </w:r>
+          <w:hyperlink w:history="1" w:anchor="_Toc3">
+            <w:r>
+              <w:t xml:space="preserve">1.2 Rumusan Masalah</w:t>
+            </w:r>
+            <w:r>
+              <w:tab/>
+            </w:r>
+            <w:r>
+              <w:fldChar w:fldCharType="begin" w:dirty="true"/>
+              <w:instrText xml:space="preserve">PAGEREF _Toc3 \h</w:instrText>
+              <w:fldChar w:fldCharType="separate"/>
+              <w:fldChar w:fldCharType="end"/>
+            </w:r>
+          </w:hyperlink>
         </w:p>
         <w:p>
           <w:pPr>
-            <w:pStyle w:val="11"/>
-            <w:ind w:left="360"/>
+            <w:pStyle w:val="TOC2"/>
             <w:tabs>
-              <w:tab w:val="right" w:leader="dot" w:pos="9026"/>
+              <w:tab w:val="right" w:pos="7937" w:leader="dot"/>
             </w:tabs>
-            <w:spacing w:before="120" w:after="60"/>
+            <w:ind w:left="220"/>
           </w:pPr>
-          <w:r>
-            <w:t>1.2 Rumusan Masalah</w:t>
-          </w:r>
-          <w:r>
-            <w:tab/>
-          </w:r>
-          <w:r>
-            <w:t>2</w:t>
-          </w:r>
+          <w:hyperlink w:history="1" w:anchor="_Toc4">
+            <w:r>
+              <w:t xml:space="preserve">1.3 Tujuan Penelitian</w:t>
+            </w:r>
+            <w:r>
+              <w:tab/>
+            </w:r>
+            <w:r>
+              <w:fldChar w:fldCharType="begin" w:dirty="true"/>
+              <w:instrText xml:space="preserve">PAGEREF _Toc4 \h</w:instrText>
+              <w:fldChar w:fldCharType="separate"/>
+              <w:fldChar w:fldCharType="end"/>
+            </w:r>
+          </w:hyperlink>
         </w:p>
         <w:p>
           <w:pPr>
-            <w:pStyle w:val="11"/>
-            <w:ind w:left="360"/>
+            <w:pStyle w:val="TOC2"/>
             <w:tabs>
-              <w:tab w:val="right" w:leader="dot" w:pos="9026"/>
+              <w:tab w:val="right" w:pos="7937" w:leader="dot"/>
             </w:tabs>
-            <w:spacing w:before="120" w:after="60"/>
+            <w:ind w:left="220"/>
           </w:pPr>
-          <w:r>
-            <w:t>1.3 Tujuan Penelitian</w:t>
-          </w:r>
-          <w:r>
-            <w:tab/>
-          </w:r>
-          <w:r>
-            <w:t>3</w:t>
-          </w:r>
+          <w:hyperlink w:history="1" w:anchor="_Toc5">
+            <w:r>
+              <w:t xml:space="preserve">1.4 Batasan Masalah</w:t>
+            </w:r>
+            <w:r>
+              <w:tab/>
+            </w:r>
+            <w:r>
+              <w:fldChar w:fldCharType="begin" w:dirty="true"/>
+              <w:instrText xml:space="preserve">PAGEREF _Toc5 \h</w:instrText>
+              <w:fldChar w:fldCharType="separate"/>
+              <w:fldChar w:fldCharType="end"/>
+            </w:r>
+          </w:hyperlink>
         </w:p>
         <w:p>
           <w:pPr>
-            <w:pStyle w:val="11"/>
-            <w:ind w:left="360"/>
+            <w:pStyle w:val="TOC2"/>
             <w:tabs>
-              <w:tab w:val="right" w:leader="dot" w:pos="9026"/>
+              <w:tab w:val="right" w:pos="7937" w:leader="dot"/>
             </w:tabs>
-            <w:spacing w:before="120" w:after="60"/>
+            <w:ind w:left="220"/>
           </w:pPr>
-          <w:r>
-            <w:t>1.4 Batasan Masalah</w:t>
-          </w:r>
-          <w:r>
-            <w:tab/>
-          </w:r>
-          <w:r>
-            <w:t>4</w:t>
-          </w:r>
+          <w:hyperlink w:history="1" w:anchor="_Toc6">
+            <w:r>
+              <w:t xml:space="preserve">1.5 Manfaat Penelitian</w:t>
+            </w:r>
+            <w:r>
+              <w:tab/>
+            </w:r>
+            <w:r>
+              <w:fldChar w:fldCharType="begin" w:dirty="true"/>
+              <w:instrText xml:space="preserve">PAGEREF _Toc6 \h</w:instrText>
+              <w:fldChar w:fldCharType="separate"/>
+              <w:fldChar w:fldCharType="end"/>
+            </w:r>
+          </w:hyperlink>
         </w:p>
         <w:p>
           <w:pPr>
-            <w:pStyle w:val="11"/>
-            <w:ind w:left="360"/>
+            <w:pStyle w:val="TOC3"/>
             <w:tabs>
-              <w:tab w:val="right" w:leader="dot" w:pos="9026"/>
+              <w:tab w:val="right" w:pos="7937" w:leader="dot"/>
             </w:tabs>
-            <w:spacing w:before="120" w:after="60"/>
+            <w:ind w:left="440"/>
           </w:pPr>
-          <w:r>
-            <w:t>1.5 Manfaat Penelitian</w:t>
-          </w:r>
-          <w:r>
-            <w:tab/>
-          </w:r>
-          <w:r>
-            <w:t>5</w:t>
-          </w:r>
+          <w:hyperlink w:history="1" w:anchor="_Toc7">
+            <w:r>
+              <w:t xml:space="preserve">1.5.1 Manfaat Teoretis</w:t>
+            </w:r>
+            <w:r>
+              <w:tab/>
+            </w:r>
+            <w:r>
+              <w:fldChar w:fldCharType="begin" w:dirty="true"/>
+              <w:instrText xml:space="preserve">PAGEREF _Toc7 \h</w:instrText>
+              <w:fldChar w:fldCharType="separate"/>
+              <w:fldChar w:fldCharType="end"/>
+            </w:r>
+          </w:hyperlink>
         </w:p>
         <w:p>
           <w:pPr>
-            <w:pStyle w:val="12"/>
-            <w:ind w:left="720"/>
+            <w:pStyle w:val="TOC3"/>
             <w:tabs>
-              <w:tab w:val="right" w:leader="dot" w:pos="9026"/>
+              <w:tab w:val="right" w:pos="7937" w:leader="dot"/>
             </w:tabs>
-            <w:spacing w:before="120" w:after="60"/>
+            <w:ind w:left="440"/>
           </w:pPr>
-          <w:r>
-            <w:t>1.5.1 Manfaat Teoretis</w:t>
-          </w:r>
-          <w:r>
-            <w:tab/>
-          </w:r>
-          <w:r>
-            <w:t>5</w:t>
-          </w:r>
+          <w:hyperlink w:history="1" w:anchor="_Toc8">
+            <w:r>
+              <w:t xml:space="preserve">1.5.2 Manfaat Praktis</w:t>
+            </w:r>
+            <w:r>
+              <w:tab/>
+            </w:r>
+            <w:r>
+              <w:fldChar w:fldCharType="begin" w:dirty="true"/>
+              <w:instrText xml:space="preserve">PAGEREF _Toc8 \h</w:instrText>
+              <w:fldChar w:fldCharType="separate"/>
+              <w:fldChar w:fldCharType="end"/>
+            </w:r>
+          </w:hyperlink>
         </w:p>
         <w:p>
           <w:pPr>
-            <w:pStyle w:val="12"/>
-            <w:ind w:left="720"/>
+            <w:pStyle w:val="TOC2"/>
             <w:tabs>
-              <w:tab w:val="right" w:leader="dot" w:pos="9026"/>
+              <w:tab w:val="right" w:pos="7937" w:leader="dot"/>
             </w:tabs>
-            <w:spacing w:before="120" w:after="60"/>
+            <w:ind w:left="220"/>
           </w:pPr>
-          <w:r>
-            <w:t>1.5.2 Manfaat Praktis</w:t>
-          </w:r>
-          <w:r>
-            <w:tab/>
-          </w:r>
-          <w:r>
-            <w:t>5</w:t>
-          </w:r>
+          <w:hyperlink w:history="1" w:anchor="_Toc9">
+            <w:r>
+              <w:t xml:space="preserve">1.6 Sistematika Penulisan</w:t>
+            </w:r>
+            <w:r>
+              <w:tab/>
+            </w:r>
+            <w:r>
+              <w:fldChar w:fldCharType="begin" w:dirty="true"/>
+              <w:instrText xml:space="preserve">PAGEREF _Toc9 \h</w:instrText>
+              <w:fldChar w:fldCharType="separate"/>
+              <w:fldChar w:fldCharType="end"/>
+            </w:r>
+          </w:hyperlink>
         </w:p>
         <w:p>
           <w:pPr>
-            <w:pStyle w:val="11"/>
-            <w:ind w:left="360"/>
+            <w:pStyle w:val="TOC1"/>
             <w:tabs>
-              <w:tab w:val="right" w:leader="dot" w:pos="9026"/>
+              <w:tab w:val="right" w:pos="7937" w:leader="dot"/>
             </w:tabs>
-            <w:spacing w:before="120" w:after="60"/>
           </w:pPr>
-          <w:r>
-            <w:t>1.6 Sistematika Penulisan</w:t>
-          </w:r>
-          <w:r>
-            <w:tab/>
-          </w:r>
-          <w:r>
-            <w:t>6</w:t>
-          </w:r>
+          <w:hyperlink w:history="1" w:anchor="_Toc10">
+            <w:r>
+              <w:t xml:space="preserve">BAB II KAJIAN PUSTAKA</w:t>
+            </w:r>
+            <w:r>
+              <w:tab/>
+            </w:r>
+            <w:r>
+              <w:fldChar w:fldCharType="begin" w:dirty="true"/>
+              <w:instrText xml:space="preserve">PAGEREF _Toc10 \h</w:instrText>
+              <w:fldChar w:fldCharType="separate"/>
+              <w:fldChar w:fldCharType="end"/>
+            </w:r>
+          </w:hyperlink>
         </w:p>
         <w:p>
           <w:pPr>
-            <w:pStyle w:val="9"/>
+            <w:pStyle w:val="TOC2"/>
             <w:tabs>
-              <w:tab w:val="right" w:leader="dot" w:pos="9026"/>
+              <w:tab w:val="right" w:pos="7937" w:leader="dot"/>
             </w:tabs>
-            <w:spacing w:before="120" w:after="60"/>
+            <w:ind w:left="220"/>
           </w:pPr>
-          <w:r>
-            <w:t>BAB II KAJIAN PUSTAKA</w:t>
-          </w:r>
-          <w:r>
-            <w:tab/>
-          </w:r>
-          <w:r>
-            <w:t>6</w:t>
-          </w:r>
+          <w:hyperlink w:history="1" w:anchor="_Toc11">
+            <w:r>
+              <w:t xml:space="preserve">2.1 Bahasa Isyarat dan Sistem Isyarat Bahasa Indonesia</w:t>
+            </w:r>
+            <w:r>
+              <w:tab/>
+            </w:r>
+            <w:r>
+              <w:fldChar w:fldCharType="begin" w:dirty="true"/>
+              <w:instrText xml:space="preserve">PAGEREF _Toc11 \h</w:instrText>
+              <w:fldChar w:fldCharType="separate"/>
+              <w:fldChar w:fldCharType="end"/>
+            </w:r>
+          </w:hyperlink>
         </w:p>
         <w:p>
           <w:pPr>
-            <w:pStyle w:val="11"/>
-            <w:ind w:left="360"/>
+            <w:pStyle w:val="TOC2"/>
             <w:tabs>
-              <w:tab w:val="right" w:leader="dot" w:pos="9026"/>
+              <w:tab w:val="right" w:pos="7937" w:leader="dot"/>
             </w:tabs>
-            <w:spacing w:before="120" w:after="60"/>
+            <w:ind w:left="220"/>
           </w:pPr>
-          <w:r>
-            <w:t>2.1 Bahasa Isyarat dan Sistem Isyarat Bahasa Indonesia</w:t>
-          </w:r>
-          <w:r>
-            <w:tab/>
-          </w:r>
-          <w:r>
-            <w:t>6</w:t>
-          </w:r>
+          <w:hyperlink w:history="1" w:anchor="_Toc12">
+            <w:r>
+              <w:t xml:space="preserve">2.2 Pembelajaran Bahasa Isyarat oleh Pendengar</w:t>
+            </w:r>
+            <w:r>
+              <w:tab/>
+            </w:r>
+            <w:r>
+              <w:fldChar w:fldCharType="begin" w:dirty="true"/>
+              <w:instrText xml:space="preserve">PAGEREF _Toc12 \h</w:instrText>
+              <w:fldChar w:fldCharType="separate"/>
+              <w:fldChar w:fldCharType="end"/>
+            </w:r>
+          </w:hyperlink>
         </w:p>
         <w:p>
           <w:pPr>
-            <w:pStyle w:val="11"/>
-            <w:ind w:left="360"/>
+            <w:pStyle w:val="TOC2"/>
             <w:tabs>
-              <w:tab w:val="right" w:leader="dot" w:pos="9026"/>
+              <w:tab w:val="right" w:pos="7937" w:leader="dot"/>
             </w:tabs>
-            <w:spacing w:before="120" w:after="60"/>
+            <w:ind w:left="220"/>
           </w:pPr>
-          <w:r>
-            <w:t>2.2 Pembelajaran Bahasa Isyarat oleh Pendengar</w:t>
-          </w:r>
-          <w:r>
-            <w:tab/>
-          </w:r>
-          <w:r>
-            <w:t>7</w:t>
-          </w:r>
+          <w:hyperlink w:history="1" w:anchor="_Toc13">
+            <w:r>
+              <w:t xml:space="preserve">2.3 Wi-Fi *Channel State Information*</w:t>
+            </w:r>
+            <w:r>
+              <w:tab/>
+            </w:r>
+            <w:r>
+              <w:fldChar w:fldCharType="begin" w:dirty="true"/>
+              <w:instrText xml:space="preserve">PAGEREF _Toc13 \h</w:instrText>
+              <w:fldChar w:fldCharType="separate"/>
+              <w:fldChar w:fldCharType="end"/>
+            </w:r>
+          </w:hyperlink>
         </w:p>
         <w:p>
           <w:pPr>
-            <w:pStyle w:val="11"/>
-            <w:ind w:left="360"/>
+            <w:pStyle w:val="TOC2"/>
             <w:tabs>
-              <w:tab w:val="right" w:leader="dot" w:pos="9026"/>
+              <w:tab w:val="right" w:pos="7937" w:leader="dot"/>
             </w:tabs>
-            <w:spacing w:before="120" w:after="60"/>
+            <w:ind w:left="220"/>
           </w:pPr>
-          <w:r>
-            <w:t>2.3 Wi-Fi *Channel State Information*</w:t>
-          </w:r>
-          <w:r>
-            <w:tab/>
-          </w:r>
-          <w:r>
-            <w:t>8</w:t>
-          </w:r>
+          <w:hyperlink w:history="1" w:anchor="_Toc14">
+            <w:r>
+              <w:t xml:space="preserve">2.4 Mikrokontroler ESP32 dan Platform RuView</w:t>
+            </w:r>
+            <w:r>
+              <w:tab/>
+            </w:r>
+            <w:r>
+              <w:fldChar w:fldCharType="begin" w:dirty="true"/>
+              <w:instrText xml:space="preserve">PAGEREF _Toc14 \h</w:instrText>
+              <w:fldChar w:fldCharType="separate"/>
+              <w:fldChar w:fldCharType="end"/>
+            </w:r>
+          </w:hyperlink>
         </w:p>
         <w:p>
           <w:pPr>
-            <w:pStyle w:val="11"/>
-            <w:ind w:left="360"/>
+            <w:pStyle w:val="TOC2"/>
             <w:tabs>
-              <w:tab w:val="right" w:leader="dot" w:pos="9026"/>
+              <w:tab w:val="right" w:pos="7937" w:leader="dot"/>
             </w:tabs>
-            <w:spacing w:before="120" w:after="60"/>
+            <w:ind w:left="220"/>
           </w:pPr>
-          <w:r>
-            <w:t>2.4 Mikrokontroler ESP32 dan Platform RuView</w:t>
-          </w:r>
-          <w:r>
-            <w:tab/>
-          </w:r>
-          <w:r>
-            <w:t>9</w:t>
-          </w:r>
+          <w:hyperlink w:history="1" w:anchor="_Toc15">
+            <w:r>
+              <w:t xml:space="preserve">2.5 Estimasi Pose Berbasis Visi dan Perannya dalam Perekaman *Dataset*</w:t>
+            </w:r>
+            <w:r>
+              <w:tab/>
+            </w:r>
+            <w:r>
+              <w:fldChar w:fldCharType="begin" w:dirty="true"/>
+              <w:instrText xml:space="preserve">PAGEREF _Toc15 \h</w:instrText>
+              <w:fldChar w:fldCharType="separate"/>
+              <w:fldChar w:fldCharType="end"/>
+            </w:r>
+          </w:hyperlink>
         </w:p>
         <w:p>
           <w:pPr>
-            <w:pStyle w:val="11"/>
-            <w:ind w:left="360"/>
+            <w:pStyle w:val="TOC2"/>
             <w:tabs>
-              <w:tab w:val="right" w:leader="dot" w:pos="9026"/>
+              <w:tab w:val="right" w:pos="7937" w:leader="dot"/>
             </w:tabs>
-            <w:spacing w:before="120" w:after="60"/>
+            <w:ind w:left="220"/>
           </w:pPr>
-          <w:r>
-            <w:t>2.5 Estimasi Pose Berbasis Visi dan Perannya dalam Perekaman *Dataset*</w:t>
-          </w:r>
-          <w:r>
-            <w:tab/>
-          </w:r>
-          <w:r>
-            <w:t>10</w:t>
-          </w:r>
+          <w:hyperlink w:history="1" w:anchor="_Toc16">
+            <w:r>
+              <w:t xml:space="preserve">2.6 Pengenalan Isyarat dan Gestur Berbasis CSI</w:t>
+            </w:r>
+            <w:r>
+              <w:tab/>
+            </w:r>
+            <w:r>
+              <w:fldChar w:fldCharType="begin" w:dirty="true"/>
+              <w:instrText xml:space="preserve">PAGEREF _Toc16 \h</w:instrText>
+              <w:fldChar w:fldCharType="separate"/>
+              <w:fldChar w:fldCharType="end"/>
+            </w:r>
+          </w:hyperlink>
         </w:p>
         <w:p>
           <w:pPr>
-            <w:pStyle w:val="11"/>
-            <w:ind w:left="360"/>
+            <w:pStyle w:val="TOC2"/>
             <w:tabs>
-              <w:tab w:val="right" w:leader="dot" w:pos="9026"/>
+              <w:tab w:val="right" w:pos="7937" w:leader="dot"/>
             </w:tabs>
-            <w:spacing w:before="120" w:after="60"/>
+            <w:ind w:left="220"/>
           </w:pPr>
-          <w:r>
-            <w:t>2.6 Pengenalan Isyarat dan Gestur Berbasis CSI</w:t>
-          </w:r>
-          <w:r>
-            <w:tab/>
-          </w:r>
-          <w:r>
-            <w:t>10</w:t>
-          </w:r>
+          <w:hyperlink w:history="1" w:anchor="_Toc17">
+            <w:r>
+              <w:t xml:space="preserve">2.7 Evaluasi Kelayakan</w:t>
+            </w:r>
+            <w:r>
+              <w:tab/>
+            </w:r>
+            <w:r>
+              <w:fldChar w:fldCharType="begin" w:dirty="true"/>
+              <w:instrText xml:space="preserve">PAGEREF _Toc17 \h</w:instrText>
+              <w:fldChar w:fldCharType="separate"/>
+              <w:fldChar w:fldCharType="end"/>
+            </w:r>
+          </w:hyperlink>
         </w:p>
         <w:p>
           <w:pPr>
-            <w:pStyle w:val="11"/>
-            <w:ind w:left="360"/>
+            <w:pStyle w:val="TOC2"/>
             <w:tabs>
-              <w:tab w:val="right" w:leader="dot" w:pos="9026"/>
+              <w:tab w:val="right" w:pos="7937" w:leader="dot"/>
             </w:tabs>
-            <w:spacing w:before="120" w:after="60"/>
+            <w:ind w:left="220"/>
           </w:pPr>
-          <w:r>
-            <w:t>2.7 Evaluasi Kelayakan</w:t>
-          </w:r>
-          <w:r>
-            <w:tab/>
-          </w:r>
-          <w:r>
-            <w:t>11</w:t>
-          </w:r>
+          <w:hyperlink w:history="1" w:anchor="_Toc18">
+            <w:r>
+              <w:t xml:space="preserve">2.8 Penelitian Terdahulu</w:t>
+            </w:r>
+            <w:r>
+              <w:tab/>
+            </w:r>
+            <w:r>
+              <w:fldChar w:fldCharType="begin" w:dirty="true"/>
+              <w:instrText xml:space="preserve">PAGEREF _Toc18 \h</w:instrText>
+              <w:fldChar w:fldCharType="separate"/>
+              <w:fldChar w:fldCharType="end"/>
+            </w:r>
+          </w:hyperlink>
         </w:p>
         <w:p>
           <w:pPr>
-            <w:pStyle w:val="11"/>
-            <w:ind w:left="360"/>
+            <w:pStyle w:val="TOC1"/>
             <w:tabs>
-              <w:tab w:val="right" w:leader="dot" w:pos="9026"/>
+              <w:tab w:val="right" w:pos="7937" w:leader="dot"/>
             </w:tabs>
-            <w:spacing w:before="120" w:after="60"/>
           </w:pPr>
-          <w:r>
-            <w:t>2.8 Penelitian Terdahulu</w:t>
-          </w:r>
-          <w:r>
-            <w:tab/>
-          </w:r>
-          <w:r>
-            <w:t>12</w:t>
-          </w:r>
+          <w:hyperlink w:history="1" w:anchor="_Toc19">
+            <w:r>
+              <w:t xml:space="preserve">BAB III METODE PENELITIAN</w:t>
+            </w:r>
+            <w:r>
+              <w:tab/>
+            </w:r>
+            <w:r>
+              <w:fldChar w:fldCharType="begin" w:dirty="true"/>
+              <w:instrText xml:space="preserve">PAGEREF _Toc19 \h</w:instrText>
+              <w:fldChar w:fldCharType="separate"/>
+              <w:fldChar w:fldCharType="end"/>
+            </w:r>
+          </w:hyperlink>
         </w:p>
         <w:p>
           <w:pPr>
-            <w:pStyle w:val="9"/>
+            <w:pStyle w:val="TOC2"/>
             <w:tabs>
-              <w:tab w:val="right" w:leader="dot" w:pos="9026"/>
+              <w:tab w:val="right" w:pos="7937" w:leader="dot"/>
             </w:tabs>
-            <w:spacing w:before="120" w:after="60"/>
+            <w:ind w:left="220"/>
           </w:pPr>
-          <w:r>
-            <w:t>BAB III METODE PENELITIAN</w:t>
-          </w:r>
-          <w:r>
-            <w:tab/>
-          </w:r>
-          <w:r>
-            <w:t>13</w:t>
-          </w:r>
+          <w:hyperlink w:history="1" w:anchor="_Toc20">
+            <w:r>
+              <w:t xml:space="preserve">3.1 Desain Penelitian</w:t>
+            </w:r>
+            <w:r>
+              <w:tab/>
+            </w:r>
+            <w:r>
+              <w:fldChar w:fldCharType="begin" w:dirty="true"/>
+              <w:instrText xml:space="preserve">PAGEREF _Toc20 \h</w:instrText>
+              <w:fldChar w:fldCharType="separate"/>
+              <w:fldChar w:fldCharType="end"/>
+            </w:r>
+          </w:hyperlink>
         </w:p>
         <w:p>
           <w:pPr>
-            <w:pStyle w:val="11"/>
-            <w:ind w:left="360"/>
+            <w:pStyle w:val="TOC2"/>
             <w:tabs>
-              <w:tab w:val="right" w:leader="dot" w:pos="9026"/>
+              <w:tab w:val="right" w:pos="7937" w:leader="dot"/>
             </w:tabs>
-            <w:spacing w:before="120" w:after="60"/>
+            <w:ind w:left="220"/>
           </w:pPr>
-          <w:r>
-            <w:t>3.1 Desain Penelitian</w:t>
-          </w:r>
-          <w:r>
-            <w:tab/>
-          </w:r>
-          <w:r>
-            <w:t>13</w:t>
-          </w:r>
+          <w:hyperlink w:history="1" w:anchor="_Toc21">
+            <w:r>
+              <w:t xml:space="preserve">3.2 Tahapan Penelitian</w:t>
+            </w:r>
+            <w:r>
+              <w:tab/>
+            </w:r>
+            <w:r>
+              <w:fldChar w:fldCharType="begin" w:dirty="true"/>
+              <w:instrText xml:space="preserve">PAGEREF _Toc21 \h</w:instrText>
+              <w:fldChar w:fldCharType="separate"/>
+              <w:fldChar w:fldCharType="end"/>
+            </w:r>
+          </w:hyperlink>
         </w:p>
         <w:p>
           <w:pPr>
-            <w:pStyle w:val="11"/>
-            <w:ind w:left="360"/>
+            <w:pStyle w:val="TOC3"/>
             <w:tabs>
-              <w:tab w:val="right" w:leader="dot" w:pos="9026"/>
+              <w:tab w:val="right" w:pos="7937" w:leader="dot"/>
             </w:tabs>
-            <w:spacing w:before="120" w:after="60"/>
+            <w:ind w:left="440"/>
           </w:pPr>
-          <w:r>
-            <w:t>3.2 Tahapan Penelitian</w:t>
-          </w:r>
-          <w:r>
-            <w:tab/>
-          </w:r>
-          <w:r>
-            <w:t>13</w:t>
-          </w:r>
+          <w:hyperlink w:history="1" w:anchor="_Toc22">
+            <w:r>
+              <w:t xml:space="preserve">3.2.1 Tahap T0: Replikasi Platform dan Uji Delta-CSI (M1–M2)</w:t>
+            </w:r>
+            <w:r>
+              <w:tab/>
+            </w:r>
+            <w:r>
+              <w:fldChar w:fldCharType="begin" w:dirty="true"/>
+              <w:instrText xml:space="preserve">PAGEREF _Toc22 \h</w:instrText>
+              <w:fldChar w:fldCharType="separate"/>
+              <w:fldChar w:fldCharType="end"/>
+            </w:r>
+          </w:hyperlink>
         </w:p>
         <w:p>
           <w:pPr>
-            <w:pStyle w:val="12"/>
-            <w:ind w:left="720"/>
+            <w:pStyle w:val="TOC3"/>
             <w:tabs>
-              <w:tab w:val="right" w:leader="dot" w:pos="9026"/>
+              <w:tab w:val="right" w:pos="7937" w:leader="dot"/>
             </w:tabs>
-            <w:spacing w:before="120" w:after="60"/>
+            <w:ind w:left="440"/>
           </w:pPr>
-          <w:r>
-            <w:t>3.2.1 Tahap T0: Replikasi Platform dan Uji Delta-CSI (M1–M2)</w:t>
-          </w:r>
-          <w:r>
-            <w:tab/>
-          </w:r>
-          <w:r>
-            <w:t>14</w:t>
-          </w:r>
+          <w:hyperlink w:history="1" w:anchor="_Toc23">
+            <w:r>
+              <w:t xml:space="preserve">3.2.2 Tahap T1: Kurasi Isyarat dan Protokol (M2–M4)</w:t>
+            </w:r>
+            <w:r>
+              <w:tab/>
+            </w:r>
+            <w:r>
+              <w:fldChar w:fldCharType="begin" w:dirty="true"/>
+              <w:instrText xml:space="preserve">PAGEREF _Toc23 \h</w:instrText>
+              <w:fldChar w:fldCharType="separate"/>
+              <w:fldChar w:fldCharType="end"/>
+            </w:r>
+          </w:hyperlink>
         </w:p>
         <w:p>
           <w:pPr>
-            <w:pStyle w:val="12"/>
-            <w:ind w:left="720"/>
+            <w:pStyle w:val="TOC3"/>
             <w:tabs>
-              <w:tab w:val="right" w:leader="dot" w:pos="9026"/>
+              <w:tab w:val="right" w:pos="7937" w:leader="dot"/>
             </w:tabs>
-            <w:spacing w:before="120" w:after="60"/>
+            <w:ind w:left="440"/>
           </w:pPr>
-          <w:r>
-            <w:t>3.2.2 Tahap T1: Kurasi Isyarat dan Protokol (M2–M4)</w:t>
-          </w:r>
-          <w:r>
-            <w:tab/>
-          </w:r>
-          <w:r>
-            <w:t>14</w:t>
-          </w:r>
+          <w:hyperlink w:history="1" w:anchor="_Toc24">
+            <w:r>
+              <w:t xml:space="preserve">3.2.3 Tahap T2: Perekaman *Dataset* dan Klasifikasi (M4–M8)</w:t>
+            </w:r>
+            <w:r>
+              <w:tab/>
+            </w:r>
+            <w:r>
+              <w:fldChar w:fldCharType="begin" w:dirty="true"/>
+              <w:instrText xml:space="preserve">PAGEREF _Toc24 \h</w:instrText>
+              <w:fldChar w:fldCharType="separate"/>
+              <w:fldChar w:fldCharType="end"/>
+            </w:r>
+          </w:hyperlink>
         </w:p>
         <w:p>
           <w:pPr>
-            <w:pStyle w:val="12"/>
-            <w:ind w:left="720"/>
+            <w:pStyle w:val="TOC3"/>
             <w:tabs>
-              <w:tab w:val="right" w:leader="dot" w:pos="9026"/>
+              <w:tab w:val="right" w:pos="7937" w:leader="dot"/>
             </w:tabs>
-            <w:spacing w:before="120" w:after="60"/>
+            <w:ind w:left="440"/>
           </w:pPr>
-          <w:r>
-            <w:t>3.2.3 Tahap T2: Perekaman *Dataset* dan Klasifikasi (M4–M8)</w:t>
-          </w:r>
-          <w:r>
-            <w:tab/>
-          </w:r>
-          <w:r>
-            <w:t>14</w:t>
-          </w:r>
+          <w:hyperlink w:history="1" w:anchor="_Toc25">
+            <w:r>
+              <w:t xml:space="preserve">3.2.4 Tahap T3: Uji Generalisasi (M8–M10)</w:t>
+            </w:r>
+            <w:r>
+              <w:tab/>
+            </w:r>
+            <w:r>
+              <w:fldChar w:fldCharType="begin" w:dirty="true"/>
+              <w:instrText xml:space="preserve">PAGEREF _Toc25 \h</w:instrText>
+              <w:fldChar w:fldCharType="separate"/>
+              <w:fldChar w:fldCharType="end"/>
+            </w:r>
+          </w:hyperlink>
         </w:p>
         <w:p>
           <w:pPr>
-            <w:pStyle w:val="12"/>
-            <w:ind w:left="720"/>
+            <w:pStyle w:val="TOC3"/>
             <w:tabs>
-              <w:tab w:val="right" w:leader="dot" w:pos="9026"/>
+              <w:tab w:val="right" w:pos="7937" w:leader="dot"/>
             </w:tabs>
-            <w:spacing w:before="120" w:after="60"/>
+            <w:ind w:left="440"/>
           </w:pPr>
-          <w:r>
-            <w:t>3.2.4 Tahap T3: Uji Generalisasi (M8–M10)</w:t>
-          </w:r>
-          <w:r>
-            <w:tab/>
-          </w:r>
-          <w:r>
-            <w:t>14</w:t>
-          </w:r>
+          <w:hyperlink w:history="1" w:anchor="_Toc26">
+            <w:r>
+              <w:t xml:space="preserve">3.2.5 Tahap T4: Pengemasan Mode Latihan dan Uji Kegunaan (M10–M12)</w:t>
+            </w:r>
+            <w:r>
+              <w:tab/>
+            </w:r>
+            <w:r>
+              <w:fldChar w:fldCharType="begin" w:dirty="true"/>
+              <w:instrText xml:space="preserve">PAGEREF _Toc26 \h</w:instrText>
+              <w:fldChar w:fldCharType="separate"/>
+              <w:fldChar w:fldCharType="end"/>
+            </w:r>
+          </w:hyperlink>
         </w:p>
         <w:p>
           <w:pPr>
-            <w:pStyle w:val="12"/>
-            <w:ind w:left="720"/>
+            <w:pStyle w:val="TOC3"/>
             <w:tabs>
-              <w:tab w:val="right" w:leader="dot" w:pos="9026"/>
+              <w:tab w:val="right" w:pos="7937" w:leader="dot"/>
             </w:tabs>
-            <w:spacing w:before="120" w:after="60"/>
+            <w:ind w:left="440"/>
           </w:pPr>
-          <w:r>
-            <w:t>3.2.5 Tahap T4: Pengemasan Mode Latihan dan Uji Kegunaan (M10–M12)</w:t>
-          </w:r>
-          <w:r>
-            <w:tab/>
-          </w:r>
-          <w:r>
-            <w:t>15</w:t>
-          </w:r>
+          <w:hyperlink w:history="1" w:anchor="_Toc27">
+            <w:r>
+              <w:t xml:space="preserve">3.2.6 Tahap T5: Analisis dan Penulisan (M12–M14)</w:t>
+            </w:r>
+            <w:r>
+              <w:tab/>
+            </w:r>
+            <w:r>
+              <w:fldChar w:fldCharType="begin" w:dirty="true"/>
+              <w:instrText xml:space="preserve">PAGEREF _Toc27 \h</w:instrText>
+              <w:fldChar w:fldCharType="separate"/>
+              <w:fldChar w:fldCharType="end"/>
+            </w:r>
+          </w:hyperlink>
         </w:p>
         <w:p>
           <w:pPr>
-            <w:pStyle w:val="12"/>
-            <w:ind w:left="720"/>
+            <w:pStyle w:val="TOC2"/>
             <w:tabs>
-              <w:tab w:val="right" w:leader="dot" w:pos="9026"/>
+              <w:tab w:val="right" w:pos="7937" w:leader="dot"/>
             </w:tabs>
-            <w:spacing w:before="120" w:after="60"/>
+            <w:ind w:left="220"/>
           </w:pPr>
-          <w:r>
-            <w:t>3.2.6 Tahap T5: Analisis dan Penulisan (M12–M14)</w:t>
-          </w:r>
-          <w:r>
-            <w:tab/>
-          </w:r>
-          <w:r>
-            <w:t>15</w:t>
-          </w:r>
+          <w:hyperlink w:history="1" w:anchor="_Toc28">
+            <w:r>
+              <w:t xml:space="preserve">3.3 Waktu dan Lokasi Penelitian</w:t>
+            </w:r>
+            <w:r>
+              <w:tab/>
+            </w:r>
+            <w:r>
+              <w:fldChar w:fldCharType="begin" w:dirty="true"/>
+              <w:instrText xml:space="preserve">PAGEREF _Toc28 \h</w:instrText>
+              <w:fldChar w:fldCharType="separate"/>
+              <w:fldChar w:fldCharType="end"/>
+            </w:r>
+          </w:hyperlink>
         </w:p>
         <w:p>
           <w:pPr>
-            <w:pStyle w:val="11"/>
-            <w:ind w:left="360"/>
+            <w:pStyle w:val="TOC2"/>
             <w:tabs>
-              <w:tab w:val="right" w:leader="dot" w:pos="9026"/>
+              <w:tab w:val="right" w:pos="7937" w:leader="dot"/>
             </w:tabs>
-            <w:spacing w:before="120" w:after="60"/>
+            <w:ind w:left="220"/>
           </w:pPr>
-          <w:r>
-            <w:t>3.3 Waktu dan Lokasi Penelitian</w:t>
-          </w:r>
-          <w:r>
-            <w:tab/>
-          </w:r>
-          <w:r>
-            <w:t>15</w:t>
-          </w:r>
+          <w:hyperlink w:history="1" w:anchor="_Toc29">
+            <w:r>
+              <w:t xml:space="preserve">3.4 Alat dan Bahan</w:t>
+            </w:r>
+            <w:r>
+              <w:tab/>
+            </w:r>
+            <w:r>
+              <w:fldChar w:fldCharType="begin" w:dirty="true"/>
+              <w:instrText xml:space="preserve">PAGEREF _Toc29 \h</w:instrText>
+              <w:fldChar w:fldCharType="separate"/>
+              <w:fldChar w:fldCharType="end"/>
+            </w:r>
+          </w:hyperlink>
         </w:p>
         <w:p>
           <w:pPr>
-            <w:pStyle w:val="11"/>
-            <w:ind w:left="360"/>
+            <w:pStyle w:val="TOC2"/>
             <w:tabs>
-              <w:tab w:val="right" w:leader="dot" w:pos="9026"/>
+              <w:tab w:val="right" w:pos="7937" w:leader="dot"/>
             </w:tabs>
-            <w:spacing w:before="120" w:after="60"/>
+            <w:ind w:left="220"/>
           </w:pPr>
-          <w:r>
-            <w:t>3.4 Alat dan Bahan</w:t>
-          </w:r>
-          <w:r>
-            <w:tab/>
-          </w:r>
-          <w:r>
-            <w:t>15</w:t>
-          </w:r>
+          <w:hyperlink w:history="1" w:anchor="_Toc30">
+            <w:r>
+              <w:t xml:space="preserve">3.5 Perancangan Sistem</w:t>
+            </w:r>
+            <w:r>
+              <w:tab/>
+            </w:r>
+            <w:r>
+              <w:fldChar w:fldCharType="begin" w:dirty="true"/>
+              <w:instrText xml:space="preserve">PAGEREF _Toc30 \h</w:instrText>
+              <w:fldChar w:fldCharType="separate"/>
+              <w:fldChar w:fldCharType="end"/>
+            </w:r>
+          </w:hyperlink>
         </w:p>
         <w:p>
           <w:pPr>
-            <w:pStyle w:val="11"/>
-            <w:ind w:left="360"/>
+            <w:pStyle w:val="TOC3"/>
             <w:tabs>
-              <w:tab w:val="right" w:leader="dot" w:pos="9026"/>
+              <w:tab w:val="right" w:pos="7937" w:leader="dot"/>
             </w:tabs>
-            <w:spacing w:before="120" w:after="60"/>
+            <w:ind w:left="440"/>
           </w:pPr>
-          <w:r>
-            <w:t>3.5 Perancangan Sistem</w:t>
-          </w:r>
-          <w:r>
-            <w:tab/>
-          </w:r>
-          <w:r>
-            <w:t>16</w:t>
-          </w:r>
+          <w:hyperlink w:history="1" w:anchor="_Toc31">
+            <w:r>
+              <w:t xml:space="preserve">3.5.1 Arsitektur Dua Jalur</w:t>
+            </w:r>
+            <w:r>
+              <w:tab/>
+            </w:r>
+            <w:r>
+              <w:fldChar w:fldCharType="begin" w:dirty="true"/>
+              <w:instrText xml:space="preserve">PAGEREF _Toc31 \h</w:instrText>
+              <w:fldChar w:fldCharType="separate"/>
+              <w:fldChar w:fldCharType="end"/>
+            </w:r>
+          </w:hyperlink>
         </w:p>
         <w:p>
           <w:pPr>
-            <w:pStyle w:val="12"/>
-            <w:ind w:left="720"/>
+            <w:pStyle w:val="TOC3"/>
             <w:tabs>
-              <w:tab w:val="right" w:leader="dot" w:pos="9026"/>
+              <w:tab w:val="right" w:pos="7937" w:leader="dot"/>
             </w:tabs>
-            <w:spacing w:before="120" w:after="60"/>
+            <w:ind w:left="440"/>
           </w:pPr>
-          <w:r>
-            <w:t>3.5.1 Arsitektur Dua Jalur</w:t>
-          </w:r>
-          <w:r>
-            <w:tab/>
-          </w:r>
-          <w:r>
-            <w:t>16</w:t>
-          </w:r>
+          <w:hyperlink w:history="1" w:anchor="_Toc32">
+            <w:r>
+              <w:t xml:space="preserve">3.5.2 Penempatan Node</w:t>
+            </w:r>
+            <w:r>
+              <w:tab/>
+            </w:r>
+            <w:r>
+              <w:fldChar w:fldCharType="begin" w:dirty="true"/>
+              <w:instrText xml:space="preserve">PAGEREF _Toc32 \h</w:instrText>
+              <w:fldChar w:fldCharType="separate"/>
+              <w:fldChar w:fldCharType="end"/>
+            </w:r>
+          </w:hyperlink>
         </w:p>
         <w:p>
           <w:pPr>
-            <w:pStyle w:val="12"/>
-            <w:ind w:left="720"/>
+            <w:pStyle w:val="TOC3"/>
             <w:tabs>
-              <w:tab w:val="right" w:leader="dot" w:pos="9026"/>
+              <w:tab w:val="right" w:pos="7937" w:leader="dot"/>
             </w:tabs>
-            <w:spacing w:before="120" w:after="60"/>
+            <w:ind w:left="440"/>
           </w:pPr>
-          <w:r>
-            <w:t>3.5.2 Penempatan Node</w:t>
-          </w:r>
-          <w:r>
-            <w:tab/>
-          </w:r>
-          <w:r>
-            <w:t>17</w:t>
-          </w:r>
+          <w:hyperlink w:history="1" w:anchor="_Toc33">
+            <w:r>
+              <w:t xml:space="preserve">3.5.3 Kalibrasi Ruang</w:t>
+            </w:r>
+            <w:r>
+              <w:tab/>
+            </w:r>
+            <w:r>
+              <w:fldChar w:fldCharType="begin" w:dirty="true"/>
+              <w:instrText xml:space="preserve">PAGEREF _Toc33 \h</w:instrText>
+              <w:fldChar w:fldCharType="separate"/>
+              <w:fldChar w:fldCharType="end"/>
+            </w:r>
+          </w:hyperlink>
         </w:p>
         <w:p>
           <w:pPr>
-            <w:pStyle w:val="12"/>
-            <w:ind w:left="720"/>
+            <w:pStyle w:val="TOC2"/>
             <w:tabs>
-              <w:tab w:val="right" w:leader="dot" w:pos="9026"/>
+              <w:tab w:val="right" w:pos="7937" w:leader="dot"/>
             </w:tabs>
-            <w:spacing w:before="120" w:after="60"/>
+            <w:ind w:left="220"/>
           </w:pPr>
-          <w:r>
-            <w:t>3.5.3 Kalibrasi Ruang</w:t>
-          </w:r>
-          <w:r>
-            <w:tab/>
-          </w:r>
-          <w:r>
-            <w:t>17</w:t>
-          </w:r>
+          <w:hyperlink w:history="1" w:anchor="_Toc34">
+            <w:r>
+              <w:t xml:space="preserve">3.6 Protokol Perekaman *Dataset*, Partisipan, dan Etika</w:t>
+            </w:r>
+            <w:r>
+              <w:tab/>
+            </w:r>
+            <w:r>
+              <w:fldChar w:fldCharType="begin" w:dirty="true"/>
+              <w:instrText xml:space="preserve">PAGEREF _Toc34 \h</w:instrText>
+              <w:fldChar w:fldCharType="separate"/>
+              <w:fldChar w:fldCharType="end"/>
+            </w:r>
+          </w:hyperlink>
         </w:p>
         <w:p>
           <w:pPr>
-            <w:pStyle w:val="11"/>
-            <w:ind w:left="360"/>
+            <w:pStyle w:val="TOC3"/>
             <w:tabs>
-              <w:tab w:val="right" w:leader="dot" w:pos="9026"/>
+              <w:tab w:val="right" w:pos="7937" w:leader="dot"/>
             </w:tabs>
-            <w:spacing w:before="120" w:after="60"/>
+            <w:ind w:left="440"/>
           </w:pPr>
-          <w:r>
-            <w:t>3.6 Protokol Perekaman *Dataset*, Partisipan, dan Etika</w:t>
-          </w:r>
-          <w:r>
-            <w:tab/>
-          </w:r>
-          <w:r>
-            <w:t>18</w:t>
-          </w:r>
+          <w:hyperlink w:history="1" w:anchor="_Toc35">
+            <w:r>
+              <w:t xml:space="preserve">3.6.1 Partisipan</w:t>
+            </w:r>
+            <w:r>
+              <w:tab/>
+            </w:r>
+            <w:r>
+              <w:fldChar w:fldCharType="begin" w:dirty="true"/>
+              <w:instrText xml:space="preserve">PAGEREF _Toc35 \h</w:instrText>
+              <w:fldChar w:fldCharType="separate"/>
+              <w:fldChar w:fldCharType="end"/>
+            </w:r>
+          </w:hyperlink>
         </w:p>
         <w:p>
           <w:pPr>
-            <w:pStyle w:val="12"/>
-            <w:ind w:left="720"/>
+            <w:pStyle w:val="TOC3"/>
             <w:tabs>
-              <w:tab w:val="right" w:leader="dot" w:pos="9026"/>
+              <w:tab w:val="right" w:pos="7937" w:leader="dot"/>
             </w:tabs>
-            <w:spacing w:before="120" w:after="60"/>
+            <w:ind w:left="440"/>
           </w:pPr>
-          <w:r>
-            <w:t>3.6.1 Partisipan</w:t>
-          </w:r>
-          <w:r>
-            <w:tab/>
-          </w:r>
-          <w:r>
-            <w:t>18</w:t>
-          </w:r>
+          <w:hyperlink w:history="1" w:anchor="_Toc36">
+            <w:r>
+              <w:t xml:space="preserve">3.6.2 Kurasi Isyarat</w:t>
+            </w:r>
+            <w:r>
+              <w:tab/>
+            </w:r>
+            <w:r>
+              <w:fldChar w:fldCharType="begin" w:dirty="true"/>
+              <w:instrText xml:space="preserve">PAGEREF _Toc36 \h</w:instrText>
+              <w:fldChar w:fldCharType="separate"/>
+              <w:fldChar w:fldCharType="end"/>
+            </w:r>
+          </w:hyperlink>
         </w:p>
         <w:p>
           <w:pPr>
-            <w:pStyle w:val="12"/>
-            <w:ind w:left="720"/>
+            <w:pStyle w:val="TOC3"/>
             <w:tabs>
-              <w:tab w:val="right" w:leader="dot" w:pos="9026"/>
+              <w:tab w:val="right" w:pos="7937" w:leader="dot"/>
             </w:tabs>
-            <w:spacing w:before="120" w:after="60"/>
+            <w:ind w:left="440"/>
           </w:pPr>
-          <w:r>
-            <w:t>3.6.2 Kurasi Isyarat</w:t>
-          </w:r>
-          <w:r>
-            <w:tab/>
-          </w:r>
-          <w:r>
-            <w:t>18</w:t>
-          </w:r>
+          <w:hyperlink w:history="1" w:anchor="_Toc37">
+            <w:r>
+              <w:t xml:space="preserve">3.6.3 Prosedur Perekaman</w:t>
+            </w:r>
+            <w:r>
+              <w:tab/>
+            </w:r>
+            <w:r>
+              <w:fldChar w:fldCharType="begin" w:dirty="true"/>
+              <w:instrText xml:space="preserve">PAGEREF _Toc37 \h</w:instrText>
+              <w:fldChar w:fldCharType="separate"/>
+              <w:fldChar w:fldCharType="end"/>
+            </w:r>
+          </w:hyperlink>
         </w:p>
         <w:p>
           <w:pPr>
-            <w:pStyle w:val="12"/>
-            <w:ind w:left="720"/>
+            <w:pStyle w:val="TOC3"/>
             <w:tabs>
-              <w:tab w:val="right" w:leader="dot" w:pos="9026"/>
+              <w:tab w:val="right" w:pos="7937" w:leader="dot"/>
             </w:tabs>
-            <w:spacing w:before="120" w:after="60"/>
+            <w:ind w:left="440"/>
           </w:pPr>
-          <w:r>
-            <w:t>3.6.3 Prosedur Perekaman</w:t>
-          </w:r>
-          <w:r>
-            <w:tab/>
-          </w:r>
-          <w:r>
-            <w:t>18</w:t>
-          </w:r>
+          <w:hyperlink w:history="1" w:anchor="_Toc38">
+            <w:r>
+              <w:t xml:space="preserve">3.6.4 Etika Penelitian</w:t>
+            </w:r>
+            <w:r>
+              <w:tab/>
+            </w:r>
+            <w:r>
+              <w:fldChar w:fldCharType="begin" w:dirty="true"/>
+              <w:instrText xml:space="preserve">PAGEREF _Toc38 \h</w:instrText>
+              <w:fldChar w:fldCharType="separate"/>
+              <w:fldChar w:fldCharType="end"/>
+            </w:r>
+          </w:hyperlink>
         </w:p>
         <w:p>
           <w:pPr>
-            <w:pStyle w:val="12"/>
-            <w:ind w:left="720"/>
+            <w:pStyle w:val="TOC2"/>
             <w:tabs>
-              <w:tab w:val="right" w:leader="dot" w:pos="9026"/>
+              <w:tab w:val="right" w:pos="7937" w:leader="dot"/>
             </w:tabs>
-            <w:spacing w:before="120" w:after="60"/>
+            <w:ind w:left="220"/>
           </w:pPr>
-          <w:r>
-            <w:t>3.6.4 Etika Penelitian</w:t>
-          </w:r>
-          <w:r>
-            <w:tab/>
-          </w:r>
-          <w:r>
-            <w:t>19</w:t>
-          </w:r>
+          <w:hyperlink w:history="1" w:anchor="_Toc39">
+            <w:r>
+              <w:t xml:space="preserve">3.7 Pengolahan Sinyal, Ekstraksi Fitur, dan Klasifikasi</w:t>
+            </w:r>
+            <w:r>
+              <w:tab/>
+            </w:r>
+            <w:r>
+              <w:fldChar w:fldCharType="begin" w:dirty="true"/>
+              <w:instrText xml:space="preserve">PAGEREF _Toc39 \h</w:instrText>
+              <w:fldChar w:fldCharType="separate"/>
+              <w:fldChar w:fldCharType="end"/>
+            </w:r>
+          </w:hyperlink>
         </w:p>
         <w:p>
           <w:pPr>
-            <w:pStyle w:val="11"/>
-            <w:ind w:left="360"/>
+            <w:pStyle w:val="TOC3"/>
             <w:tabs>
-              <w:tab w:val="right" w:leader="dot" w:pos="9026"/>
+              <w:tab w:val="right" w:pos="7937" w:leader="dot"/>
             </w:tabs>
-            <w:spacing w:before="120" w:after="60"/>
+            <w:ind w:left="440"/>
           </w:pPr>
-          <w:r>
-            <w:t>3.7 Pengolahan Sinyal, Ekstraksi Fitur, dan Klasifikasi</w:t>
-          </w:r>
-          <w:r>
-            <w:tab/>
-          </w:r>
-          <w:r>
-            <w:t>20</w:t>
-          </w:r>
+          <w:hyperlink w:history="1" w:anchor="_Toc40">
+            <w:r>
+              <w:t xml:space="preserve">3.7.1 Laju Pencuplikan</w:t>
+            </w:r>
+            <w:r>
+              <w:tab/>
+            </w:r>
+            <w:r>
+              <w:fldChar w:fldCharType="begin" w:dirty="true"/>
+              <w:instrText xml:space="preserve">PAGEREF _Toc40 \h</w:instrText>
+              <w:fldChar w:fldCharType="separate"/>
+              <w:fldChar w:fldCharType="end"/>
+            </w:r>
+          </w:hyperlink>
         </w:p>
         <w:p>
           <w:pPr>
-            <w:pStyle w:val="12"/>
-            <w:ind w:left="720"/>
+            <w:pStyle w:val="TOC3"/>
             <w:tabs>
-              <w:tab w:val="right" w:leader="dot" w:pos="9026"/>
+              <w:tab w:val="right" w:pos="7937" w:leader="dot"/>
             </w:tabs>
-            <w:spacing w:before="120" w:after="60"/>
+            <w:ind w:left="440"/>
           </w:pPr>
-          <w:r>
-            <w:t>3.7.1 Laju Pencuplikan</w:t>
-          </w:r>
-          <w:r>
-            <w:tab/>
-          </w:r>
-          <w:r>
-            <w:t>20</w:t>
-          </w:r>
+          <w:hyperlink w:history="1" w:anchor="_Toc41">
+            <w:r>
+              <w:t xml:space="preserve">3.7.2 Segmentasi</w:t>
+            </w:r>
+            <w:r>
+              <w:tab/>
+            </w:r>
+            <w:r>
+              <w:fldChar w:fldCharType="begin" w:dirty="true"/>
+              <w:instrText xml:space="preserve">PAGEREF _Toc41 \h</w:instrText>
+              <w:fldChar w:fldCharType="separate"/>
+              <w:fldChar w:fldCharType="end"/>
+            </w:r>
+          </w:hyperlink>
         </w:p>
         <w:p>
           <w:pPr>
-            <w:pStyle w:val="12"/>
-            <w:ind w:left="720"/>
+            <w:pStyle w:val="TOC3"/>
             <w:tabs>
-              <w:tab w:val="right" w:leader="dot" w:pos="9026"/>
+              <w:tab w:val="right" w:pos="7937" w:leader="dot"/>
             </w:tabs>
-            <w:spacing w:before="120" w:after="60"/>
+            <w:ind w:left="440"/>
           </w:pPr>
-          <w:r>
-            <w:t>3.7.2 Segmentasi</w:t>
-          </w:r>
-          <w:r>
-            <w:tab/>
-          </w:r>
-          <w:r>
-            <w:t>20</w:t>
-          </w:r>
+          <w:hyperlink w:history="1" w:anchor="_Toc42">
+            <w:r>
+              <w:t xml:space="preserve">3.7.3 Ekstraksi Fitur</w:t>
+            </w:r>
+            <w:r>
+              <w:tab/>
+            </w:r>
+            <w:r>
+              <w:fldChar w:fldCharType="begin" w:dirty="true"/>
+              <w:instrText xml:space="preserve">PAGEREF _Toc42 \h</w:instrText>
+              <w:fldChar w:fldCharType="separate"/>
+              <w:fldChar w:fldCharType="end"/>
+            </w:r>
+          </w:hyperlink>
         </w:p>
         <w:p>
           <w:pPr>
-            <w:pStyle w:val="12"/>
-            <w:ind w:left="720"/>
+            <w:pStyle w:val="TOC3"/>
             <w:tabs>
-              <w:tab w:val="right" w:leader="dot" w:pos="9026"/>
+              <w:tab w:val="right" w:pos="7937" w:leader="dot"/>
             </w:tabs>
-            <w:spacing w:before="120" w:after="60"/>
+            <w:ind w:left="440"/>
           </w:pPr>
-          <w:r>
-            <w:t>3.7.3 Ekstraksi Fitur</w:t>
-          </w:r>
-          <w:r>
-            <w:tab/>
-          </w:r>
-          <w:r>
-            <w:t>20</w:t>
-          </w:r>
+          <w:hyperlink w:history="1" w:anchor="_Toc43">
+            <w:r>
+              <w:t xml:space="preserve">3.7.4 Klasifikasi</w:t>
+            </w:r>
+            <w:r>
+              <w:tab/>
+            </w:r>
+            <w:r>
+              <w:fldChar w:fldCharType="begin" w:dirty="true"/>
+              <w:instrText xml:space="preserve">PAGEREF _Toc43 \h</w:instrText>
+              <w:fldChar w:fldCharType="separate"/>
+              <w:fldChar w:fldCharType="end"/>
+            </w:r>
+          </w:hyperlink>
         </w:p>
         <w:p>
           <w:pPr>
-            <w:pStyle w:val="12"/>
-            <w:ind w:left="720"/>
+            <w:pStyle w:val="TOC3"/>
             <w:tabs>
-              <w:tab w:val="right" w:leader="dot" w:pos="9026"/>
+              <w:tab w:val="right" w:pos="7937" w:leader="dot"/>
             </w:tabs>
-            <w:spacing w:before="120" w:after="60"/>
+            <w:ind w:left="440"/>
           </w:pPr>
-          <w:r>
-            <w:t>3.7.4 Klasifikasi</w:t>
-          </w:r>
-          <w:r>
-            <w:tab/>
-          </w:r>
-          <w:r>
-            <w:t>20</w:t>
-          </w:r>
+          <w:hyperlink w:history="1" w:anchor="_Toc44">
+            <w:r>
+              <w:t xml:space="preserve">3.7.5 Skema Pembagian Data</w:t>
+            </w:r>
+            <w:r>
+              <w:tab/>
+            </w:r>
+            <w:r>
+              <w:fldChar w:fldCharType="begin" w:dirty="true"/>
+              <w:instrText xml:space="preserve">PAGEREF _Toc44 \h</w:instrText>
+              <w:fldChar w:fldCharType="separate"/>
+              <w:fldChar w:fldCharType="end"/>
+            </w:r>
+          </w:hyperlink>
         </w:p>
         <w:p>
           <w:pPr>
-            <w:pStyle w:val="12"/>
-            <w:ind w:left="720"/>
+            <w:pStyle w:val="TOC3"/>
             <w:tabs>
-              <w:tab w:val="right" w:leader="dot" w:pos="9026"/>
+              <w:tab w:val="right" w:pos="7937" w:leader="dot"/>
             </w:tabs>
-            <w:spacing w:before="120" w:after="60"/>
+            <w:ind w:left="440"/>
           </w:pPr>
-          <w:r>
-            <w:t>3.7.5 Skema Pembagian Data</w:t>
-          </w:r>
-          <w:r>
-            <w:tab/>
-          </w:r>
-          <w:r>
-            <w:t>21</w:t>
-          </w:r>
+          <w:hyperlink w:history="1" w:anchor="_Toc45">
+            <w:r>
+              <w:t xml:space="preserve">3.7.6 Umpan Balik dengan Penolakan</w:t>
+            </w:r>
+            <w:r>
+              <w:tab/>
+            </w:r>
+            <w:r>
+              <w:fldChar w:fldCharType="begin" w:dirty="true"/>
+              <w:instrText xml:space="preserve">PAGEREF _Toc45 \h</w:instrText>
+              <w:fldChar w:fldCharType="separate"/>
+              <w:fldChar w:fldCharType="end"/>
+            </w:r>
+          </w:hyperlink>
         </w:p>
         <w:p>
           <w:pPr>
-            <w:pStyle w:val="12"/>
-            <w:ind w:left="720"/>
+            <w:pStyle w:val="TOC2"/>
             <w:tabs>
-              <w:tab w:val="right" w:leader="dot" w:pos="9026"/>
+              <w:tab w:val="right" w:pos="7937" w:leader="dot"/>
             </w:tabs>
-            <w:spacing w:before="120" w:after="60"/>
+            <w:ind w:left="220"/>
           </w:pPr>
-          <w:r>
-            <w:t>3.7.6 Umpan Balik dengan Penolakan</w:t>
-          </w:r>
-          <w:r>
-            <w:tab/>
-          </w:r>
-          <w:r>
-            <w:t>21</w:t>
-          </w:r>
+          <w:hyperlink w:history="1" w:anchor="_Toc46">
+            <w:r>
+              <w:t xml:space="preserve">3.8 Skenario Pengujian dan Metrik Evaluasi</w:t>
+            </w:r>
+            <w:r>
+              <w:tab/>
+            </w:r>
+            <w:r>
+              <w:fldChar w:fldCharType="begin" w:dirty="true"/>
+              <w:instrText xml:space="preserve">PAGEREF _Toc46 \h</w:instrText>
+              <w:fldChar w:fldCharType="separate"/>
+              <w:fldChar w:fldCharType="end"/>
+            </w:r>
+          </w:hyperlink>
         </w:p>
         <w:p>
           <w:pPr>
-            <w:pStyle w:val="11"/>
-            <w:ind w:left="360"/>
+            <w:pStyle w:val="TOC3"/>
             <w:tabs>
-              <w:tab w:val="right" w:leader="dot" w:pos="9026"/>
+              <w:tab w:val="right" w:pos="7937" w:leader="dot"/>
             </w:tabs>
-            <w:spacing w:before="120" w:after="60"/>
+            <w:ind w:left="440"/>
           </w:pPr>
-          <w:r>
-            <w:t>3.8 Skenario Pengujian dan Metrik Evaluasi</w:t>
-          </w:r>
-          <w:r>
-            <w:tab/>
-          </w:r>
-          <w:r>
-            <w:t>22</w:t>
-          </w:r>
+          <w:hyperlink w:history="1" w:anchor="_Toc47">
+            <w:r>
+              <w:t xml:space="preserve">3.8.1 Uji Delta-CSI</w:t>
+            </w:r>
+            <w:r>
+              <w:tab/>
+            </w:r>
+            <w:r>
+              <w:fldChar w:fldCharType="begin" w:dirty="true"/>
+              <w:instrText xml:space="preserve">PAGEREF _Toc47 \h</w:instrText>
+              <w:fldChar w:fldCharType="separate"/>
+              <w:fldChar w:fldCharType="end"/>
+            </w:r>
+          </w:hyperlink>
         </w:p>
         <w:p>
           <w:pPr>
-            <w:pStyle w:val="12"/>
-            <w:ind w:left="720"/>
+            <w:pStyle w:val="TOC3"/>
             <w:tabs>
-              <w:tab w:val="right" w:leader="dot" w:pos="9026"/>
+              <w:tab w:val="right" w:pos="7937" w:leader="dot"/>
             </w:tabs>
-            <w:spacing w:before="120" w:after="60"/>
+            <w:ind w:left="440"/>
           </w:pPr>
-          <w:r>
-            <w:t>3.8.1 Uji Delta-CSI</w:t>
-          </w:r>
-          <w:r>
-            <w:tab/>
-          </w:r>
-          <w:r>
-            <w:t>22</w:t>
-          </w:r>
+          <w:hyperlink w:history="1" w:anchor="_Toc48">
+            <w:r>
+              <w:t xml:space="preserve">3.8.2 Uji Klasifikasi</w:t>
+            </w:r>
+            <w:r>
+              <w:tab/>
+            </w:r>
+            <w:r>
+              <w:fldChar w:fldCharType="begin" w:dirty="true"/>
+              <w:instrText xml:space="preserve">PAGEREF _Toc48 \h</w:instrText>
+              <w:fldChar w:fldCharType="separate"/>
+              <w:fldChar w:fldCharType="end"/>
+            </w:r>
+          </w:hyperlink>
         </w:p>
         <w:p>
           <w:pPr>
-            <w:pStyle w:val="12"/>
-            <w:ind w:left="720"/>
+            <w:pStyle w:val="TOC3"/>
             <w:tabs>
-              <w:tab w:val="right" w:leader="dot" w:pos="9026"/>
+              <w:tab w:val="right" w:pos="7937" w:leader="dot"/>
             </w:tabs>
-            <w:spacing w:before="120" w:after="60"/>
+            <w:ind w:left="440"/>
           </w:pPr>
-          <w:r>
-            <w:t>3.8.2 Uji Klasifikasi</w:t>
-          </w:r>
-          <w:r>
-            <w:tab/>
-          </w:r>
-          <w:r>
-            <w:t>23</w:t>
-          </w:r>
+          <w:hyperlink w:history="1" w:anchor="_Toc49">
+            <w:r>
+              <w:t xml:space="preserve">3.8.3 Uji Operasional</w:t>
+            </w:r>
+            <w:r>
+              <w:tab/>
+            </w:r>
+            <w:r>
+              <w:fldChar w:fldCharType="begin" w:dirty="true"/>
+              <w:instrText xml:space="preserve">PAGEREF _Toc49 \h</w:instrText>
+              <w:fldChar w:fldCharType="separate"/>
+              <w:fldChar w:fldCharType="end"/>
+            </w:r>
+          </w:hyperlink>
         </w:p>
         <w:p>
           <w:pPr>
-            <w:pStyle w:val="12"/>
-            <w:ind w:left="720"/>
+            <w:pStyle w:val="TOC3"/>
             <w:tabs>
-              <w:tab w:val="right" w:leader="dot" w:pos="9026"/>
+              <w:tab w:val="right" w:pos="7937" w:leader="dot"/>
             </w:tabs>
-            <w:spacing w:before="120" w:after="60"/>
+            <w:ind w:left="440"/>
           </w:pPr>
-          <w:r>
-            <w:t>3.8.3 Uji Operasional</w:t>
-          </w:r>
-          <w:r>
-            <w:tab/>
-          </w:r>
-          <w:r>
-            <w:t>23</w:t>
-          </w:r>
+          <w:hyperlink w:history="1" w:anchor="_Toc50">
+            <w:r>
+              <w:t xml:space="preserve">3.8.4 Uji Kegunaan</w:t>
+            </w:r>
+            <w:r>
+              <w:tab/>
+            </w:r>
+            <w:r>
+              <w:fldChar w:fldCharType="begin" w:dirty="true"/>
+              <w:instrText xml:space="preserve">PAGEREF _Toc50 \h</w:instrText>
+              <w:fldChar w:fldCharType="separate"/>
+              <w:fldChar w:fldCharType="end"/>
+            </w:r>
+          </w:hyperlink>
         </w:p>
         <w:p>
           <w:pPr>
-            <w:pStyle w:val="12"/>
-            <w:ind w:left="720"/>
+            <w:pStyle w:val="TOC3"/>
             <w:tabs>
-              <w:tab w:val="right" w:leader="dot" w:pos="9026"/>
+              <w:tab w:val="right" w:pos="7937" w:leader="dot"/>
             </w:tabs>
-            <w:spacing w:before="120" w:after="60"/>
+            <w:ind w:left="440"/>
           </w:pPr>
-          <w:r>
-            <w:t>3.8.4 Uji Kegunaan</w:t>
-          </w:r>
-          <w:r>
-            <w:tab/>
-          </w:r>
-          <w:r>
-            <w:t>24</w:t>
-          </w:r>
+          <w:hyperlink w:history="1" w:anchor="_Toc51">
+            <w:r>
+              <w:t xml:space="preserve">3.8.5 Penilaian Validator dan Diagnosis Kesalahan</w:t>
+            </w:r>
+            <w:r>
+              <w:tab/>
+            </w:r>
+            <w:r>
+              <w:fldChar w:fldCharType="begin" w:dirty="true"/>
+              <w:instrText xml:space="preserve">PAGEREF _Toc51 \h</w:instrText>
+              <w:fldChar w:fldCharType="separate"/>
+              <w:fldChar w:fldCharType="end"/>
+            </w:r>
+          </w:hyperlink>
         </w:p>
         <w:p>
           <w:pPr>
-            <w:pStyle w:val="12"/>
-            <w:ind w:left="720"/>
+            <w:pStyle w:val="TOC3"/>
             <w:tabs>
-              <w:tab w:val="right" w:leader="dot" w:pos="9026"/>
+              <w:tab w:val="right" w:pos="7937" w:leader="dot"/>
             </w:tabs>
-            <w:spacing w:before="120" w:after="60"/>
+            <w:ind w:left="440"/>
           </w:pPr>
-          <w:r>
-            <w:t>3.8.5 Penilaian Validator dan Diagnosis Kesalahan</w:t>
-          </w:r>
-          <w:r>
-            <w:tab/>
-          </w:r>
-          <w:r>
-            <w:t>25</w:t>
-          </w:r>
+          <w:hyperlink w:history="1" w:anchor="_Toc52">
+            <w:r>
+              <w:t xml:space="preserve">3.8.6 Kriteria Gerbang Keputusan</w:t>
+            </w:r>
+            <w:r>
+              <w:tab/>
+            </w:r>
+            <w:r>
+              <w:fldChar w:fldCharType="begin" w:dirty="true"/>
+              <w:instrText xml:space="preserve">PAGEREF _Toc52 \h</w:instrText>
+              <w:fldChar w:fldCharType="separate"/>
+              <w:fldChar w:fldCharType="end"/>
+            </w:r>
+          </w:hyperlink>
         </w:p>
         <w:p>
           <w:pPr>
-            <w:pStyle w:val="12"/>
-            <w:ind w:left="720"/>
+            <w:pStyle w:val="TOC2"/>
             <w:tabs>
-              <w:tab w:val="right" w:leader="dot" w:pos="9026"/>
+              <w:tab w:val="right" w:pos="7937" w:leader="dot"/>
             </w:tabs>
-            <w:spacing w:before="120" w:after="60"/>
+            <w:ind w:left="220"/>
           </w:pPr>
-          <w:r>
-            <w:t>3.8.6 Kriteria Gerbang Keputusan</w:t>
-          </w:r>
-          <w:r>
-            <w:tab/>
-          </w:r>
-          <w:r>
-            <w:t>25</w:t>
-          </w:r>
+          <w:hyperlink w:history="1" w:anchor="_Toc53">
+            <w:r>
+              <w:t xml:space="preserve">3.9 Jadwal Penelitian</w:t>
+            </w:r>
+            <w:r>
+              <w:tab/>
+            </w:r>
+            <w:r>
+              <w:fldChar w:fldCharType="begin" w:dirty="true"/>
+              <w:instrText xml:space="preserve">PAGEREF _Toc53 \h</w:instrText>
+              <w:fldChar w:fldCharType="separate"/>
+              <w:fldChar w:fldCharType="end"/>
+            </w:r>
+          </w:hyperlink>
         </w:p>
         <w:p>
           <w:pPr>
-            <w:pStyle w:val="11"/>
-            <w:ind w:left="360"/>
+            <w:pStyle w:val="TOC2"/>
             <w:tabs>
-              <w:tab w:val="right" w:leader="dot" w:pos="9026"/>
+              <w:tab w:val="right" w:pos="7937" w:leader="dot"/>
             </w:tabs>
-            <w:spacing w:before="120" w:after="60"/>
+            <w:ind w:left="220"/>
           </w:pPr>
-          <w:r>
-            <w:t>3.9 Jadwal Penelitian</w:t>
-          </w:r>
-          <w:r>
-            <w:tab/>
-          </w:r>
-          <w:r>
-            <w:t>25</w:t>
-          </w:r>
+          <w:hyperlink w:history="1" w:anchor="_Toc54">
+            <w:r>
+              <w:t xml:space="preserve">3.10 Parameter Rancangan yang Ditetapkan Kemudian</w:t>
+            </w:r>
+            <w:r>
+              <w:tab/>
+            </w:r>
+            <w:r>
+              <w:fldChar w:fldCharType="begin" w:dirty="true"/>
+              <w:instrText xml:space="preserve">PAGEREF _Toc54 \h</w:instrText>
+              <w:fldChar w:fldCharType="separate"/>
+              <w:fldChar w:fldCharType="end"/>
+            </w:r>
+          </w:hyperlink>
         </w:p>
         <w:p>
           <w:pPr>
-            <w:pStyle w:val="11"/>
-            <w:ind w:left="360"/>
+            <w:pStyle w:val="TOC1"/>
             <w:tabs>
-              <w:tab w:val="right" w:leader="dot" w:pos="9026"/>
+              <w:tab w:val="right" w:pos="7937" w:leader="dot"/>
             </w:tabs>
-            <w:spacing w:before="120" w:after="60"/>
           </w:pPr>
-          <w:r>
-            <w:t>3.10 Parameter Rancangan yang Ditetapkan Kemudian</w:t>
-          </w:r>
-          <w:r>
-            <w:tab/>
-          </w:r>
-          <w:r>
-            <w:t>26</w:t>
-          </w:r>
-        </w:p>
-        <w:p>
-          <w:pPr>
-            <w:pStyle w:val="9"/>
-            <w:tabs>
-              <w:tab w:val="right" w:leader="dot" w:pos="9026"/>
-            </w:tabs>
-            <w:spacing w:before="120" w:after="60"/>
-          </w:pPr>
-          <w:r>
-            <w:t>DAFTAR PUSTAKA</w:t>
-          </w:r>
-          <w:r>
-            <w:tab/>
-          </w:r>
-          <w:r>
-            <w:t>26</w:t>
-          </w:r>
+          <w:hyperlink w:history="1" w:anchor="_Toc55">
+            <w:r>
+              <w:t xml:space="preserve">DAFTAR PUSTAKA</w:t>
+            </w:r>
+            <w:r>
+              <w:tab/>
+            </w:r>
+            <w:r>
+              <w:fldChar w:fldCharType="begin" w:dirty="true"/>
+              <w:instrText xml:space="preserve">PAGEREF _Toc55 \h</w:instrText>
+              <w:fldChar w:fldCharType="separate"/>
+              <w:fldChar w:fldCharType="end"/>
+            </w:r>
+          </w:hyperlink>
         </w:p>
         <w:p>
           <w:r>
@@ -10873,7 +11068,7 @@
       <w:r>
         <w:drawing>
           <wp:inline distT="0" distB="0" distL="0" distR="0">
-            <wp:extent cx="5038725" cy="7153275"/>
+            <wp:extent cx="5038725" cy="4600575"/>
             <wp:effectExtent t="0" r="0" b="0" l="0"/>
             <wp:docPr id="1" name="" descr="" title=""/>
             <wp:cNvGraphicFramePr>
@@ -10898,7 +11093,7 @@
                   <pic:spPr bwMode="auto">
                     <a:xfrm>
                       <a:off x="0" y="0"/>
-                      <a:ext cx="5038725" cy="7153275"/>
+                      <a:ext cx="5038725" cy="4600575"/>
                     </a:xfrm>
                     <a:prstGeom prst="rect">
                       <a:avLst/>
@@ -14093,7 +14288,7 @@
       <w:r>
         <w:drawing>
           <wp:inline distT="0" distB="0" distL="0" distR="0">
-            <wp:extent cx="5038725" cy="5734050"/>
+            <wp:extent cx="5038725" cy="3200400"/>
             <wp:effectExtent t="0" r="0" b="0" l="0"/>
             <wp:docPr id="2" name="" descr="" title=""/>
             <wp:cNvGraphicFramePr>
@@ -14118,7 +14313,7 @@
                   <pic:spPr bwMode="auto">
                     <a:xfrm>
                       <a:off x="0" y="0"/>
-                      <a:ext cx="5038725" cy="5734050"/>
+                      <a:ext cx="5038725" cy="3200400"/>
                     </a:xfrm>
                     <a:prstGeom prst="rect">
                       <a:avLst/>
@@ -29661,7 +29856,7 @@
         <w:szCs w:val="20"/>
       </w:rPr>
       <w:fldChar w:fldCharType="begin"/>
-      <w:instrText xml:space="preserve"> PAGE \* roman \* MERGEFORMAT </w:instrText>
+      <w:instrText xml:space="preserve">PAGE</w:instrText>
       <w:fldChar w:fldCharType="separate"/>
       <w:fldChar w:fldCharType="end"/>
     </w:r>
@@ -29683,7 +29878,7 @@
         <w:szCs w:val="20"/>
       </w:rPr>
       <w:fldChar w:fldCharType="begin"/>
-      <w:instrText xml:space="preserve"> PAGE \* arabic \* MERGEFORMAT </w:instrText>
+      <w:instrText xml:space="preserve">PAGE</w:instrText>
       <w:fldChar w:fldCharType="separate"/>
       <w:fldChar w:fldCharType="end"/>
     </w:r>
@@ -29925,9 +30120,6 @@
     </w:rPr>
   </w:style>
   <w:style w:type="paragraph" w:styleId="Heading4">
-    <w:pPr>
-      <w:outlineLvl w:val="3"/>
-    </w:pPr>
     <w:name w:val="Heading 4"/>
     <w:basedOn w:val="Normal"/>
     <w:next w:val="Normal"/>
@@ -29939,9 +30131,6 @@
     </w:rPr>
   </w:style>
   <w:style w:type="paragraph" w:styleId="Heading5">
-    <w:pPr>
-      <w:outlineLvl w:val="4"/>
-    </w:pPr>
     <w:name w:val="Heading 5"/>
     <w:basedOn w:val="Normal"/>
     <w:next w:val="Normal"/>
@@ -29951,9 +30140,6 @@
     </w:rPr>
   </w:style>
   <w:style w:type="paragraph" w:styleId="Heading6">
-    <w:pPr>
-      <w:outlineLvl w:val="5"/>
-    </w:pPr>
     <w:name w:val="Heading 6"/>
     <w:basedOn w:val="Normal"/>
     <w:next w:val="Normal"/>
@@ -30060,45 +30246,6 @@
       <w:sz w:val="20"/>
       <w:szCs w:val="20"/>
     </w:rPr>
-  </w:style>
-  <w:style xmlns:w="http://schemas.openxmlformats.org/wordprocessingml/2006/main" w:type="paragraph" w:styleId="9">
-    <w:name w:val="toc 1"/>
-    <w:basedOn w:val="Normal"/>
-    <w:uiPriority w:val="39"/>
-    <w:pPr>
-      <w:tabs>
-        <w:tab w:val="right" w:leader="dot" w:pos="9026"/>
-      </w:tabs>
-      <w:spacing w:before="120" w:after="60"/>
-    </w:pPr>
-    <w:rPr>
-      <w:b/>
-      <w:bCs/>
-    </w:rPr>
-  </w:style>
-  <w:style xmlns:w="http://schemas.openxmlformats.org/wordprocessingml/2006/main" w:type="paragraph" w:styleId="11">
-    <w:name w:val="toc 2"/>
-    <w:basedOn w:val="Normal"/>
-    <w:uiPriority w:val="39"/>
-    <w:pPr>
-      <w:tabs>
-        <w:tab w:val="right" w:leader="dot" w:pos="9026"/>
-      </w:tabs>
-      <w:ind w:left="360"/>
-      <w:spacing w:before="60" w:after="40"/>
-    </w:pPr>
-  </w:style>
-  <w:style xmlns:w="http://schemas.openxmlformats.org/wordprocessingml/2006/main" w:type="paragraph" w:styleId="12">
-    <w:name w:val="toc 3"/>
-    <w:basedOn w:val="Normal"/>
-    <w:uiPriority w:val="39"/>
-    <w:pPr>
-      <w:tabs>
-        <w:tab w:val="right" w:leader="dot" w:pos="9026"/>
-      </w:tabs>
-      <w:ind w:left="720"/>
-      <w:spacing w:before="40" w:after="20"/>
-    </w:pPr>
   </w:style>
 </w:styles>
 </file>

</xml_diff>